<commit_message>
Deploy latest version of PFS documents a9d7eb348b476248639352170e178017af894de7
</commit_message>
<xml_diff>
--- a/latest/NLSR.docx
+++ b/latest/NLSR.docx
@@ -5470,7 +5470,7 @@
         <w:t xml:space="preserve"> </w:t>
       </w:r>
       <w:r>
-        <w:t xml:space="preserve">The requirements indicate both the necessary outcomes and the minimum steps necessary to be deemed to have achieved those outcomes. Radiometric corrections must lead to a valid measurement.</w:t>
+        <w:t xml:space="preserve">The requirements indicate both the necessary outcomes and the minimum steps necessary to be deemed to have achieved those outcomes.</w:t>
       </w:r>
     </w:p>
     <w:bookmarkStart w:id="164" w:name="sec:rac.measurements-measurement-nlsr"/>
@@ -5523,6 +5523,26 @@
       </w:pPr>
       <w:r>
         <w:t xml:space="preserve">Pixel values that are expressed as a measurement of the nighttime light radiance.</w:t>
+      </w:r>
+    </w:p>
+    <w:p>
+      <w:pPr>
+        <w:pStyle w:val="Textkrper"/>
+      </w:pPr>
+      <w:r>
+        <w:t xml:space="preserve">Notes:</w:t>
+      </w:r>
+    </w:p>
+    <w:p>
+      <w:pPr>
+        <w:pStyle w:val="Compact"/>
+        <w:numPr>
+          <w:ilvl w:val="0"/>
+          <w:numId w:val="1045"/>
+        </w:numPr>
+      </w:pPr>
+      <w:r>
+        <w:t xml:space="preserve">Radiometric corrections must lead to a valid measurement of surface reflectance.</w:t>
       </w:r>
     </w:p>
     <w:bookmarkEnd w:id="161"/>
@@ -5575,7 +5595,7 @@
         <w:pStyle w:val="Compact"/>
         <w:numPr>
           <w:ilvl w:val="0"/>
-          <w:numId w:val="1045"/>
+          <w:numId w:val="1046"/>
         </w:numPr>
       </w:pPr>
       <w:r>
@@ -5587,7 +5607,7 @@
         <w:pStyle w:val="Compact"/>
         <w:numPr>
           <w:ilvl w:val="0"/>
-          <w:numId w:val="1045"/>
+          <w:numId w:val="1046"/>
         </w:numPr>
       </w:pPr>
       <w:r>
@@ -5599,7 +5619,7 @@
         <w:pStyle w:val="Compact"/>
         <w:numPr>
           <w:ilvl w:val="0"/>
-          <w:numId w:val="1045"/>
+          <w:numId w:val="1046"/>
         </w:numPr>
       </w:pPr>
       <w:r>
@@ -5611,7 +5631,7 @@
         <w:pStyle w:val="Compact"/>
         <w:numPr>
           <w:ilvl w:val="0"/>
-          <w:numId w:val="1045"/>
+          <w:numId w:val="1046"/>
         </w:numPr>
       </w:pPr>
       <w:r>
@@ -5721,7 +5741,7 @@
         <w:pStyle w:val="Compact"/>
         <w:numPr>
           <w:ilvl w:val="0"/>
-          <w:numId w:val="1046"/>
+          <w:numId w:val="1047"/>
         </w:numPr>
       </w:pPr>
       <w:r>
@@ -5750,7 +5770,7 @@
         <w:pStyle w:val="Compact"/>
         <w:numPr>
           <w:ilvl w:val="0"/>
-          <w:numId w:val="1046"/>
+          <w:numId w:val="1047"/>
         </w:numPr>
       </w:pPr>
       <w:r>
@@ -5772,7 +5792,7 @@
         <w:pStyle w:val="Compact"/>
         <w:numPr>
           <w:ilvl w:val="0"/>
-          <w:numId w:val="1047"/>
+          <w:numId w:val="1048"/>
         </w:numPr>
       </w:pPr>
       <w:r>
@@ -5784,7 +5804,7 @@
         <w:pStyle w:val="Compact"/>
         <w:numPr>
           <w:ilvl w:val="0"/>
-          <w:numId w:val="1047"/>
+          <w:numId w:val="1048"/>
         </w:numPr>
       </w:pPr>
       <w:r>
@@ -5796,7 +5816,7 @@
         <w:pStyle w:val="Compact"/>
         <w:numPr>
           <w:ilvl w:val="0"/>
-          <w:numId w:val="1047"/>
+          <w:numId w:val="1048"/>
         </w:numPr>
       </w:pPr>
       <w:r>
@@ -5808,7 +5828,7 @@
         <w:pStyle w:val="Compact"/>
         <w:numPr>
           <w:ilvl w:val="0"/>
-          <w:numId w:val="1047"/>
+          <w:numId w:val="1048"/>
         </w:numPr>
       </w:pPr>
       <w:r>
@@ -5916,7 +5936,7 @@
         <w:pStyle w:val="Compact"/>
         <w:numPr>
           <w:ilvl w:val="0"/>
-          <w:numId w:val="1048"/>
+          <w:numId w:val="1049"/>
         </w:numPr>
       </w:pPr>
       <w:r>
@@ -5938,7 +5958,7 @@
         <w:pStyle w:val="Compact"/>
         <w:numPr>
           <w:ilvl w:val="0"/>
-          <w:numId w:val="1049"/>
+          <w:numId w:val="1050"/>
         </w:numPr>
       </w:pPr>
       <w:r>
@@ -5950,7 +5970,7 @@
         <w:pStyle w:val="Compact"/>
         <w:numPr>
           <w:ilvl w:val="0"/>
-          <w:numId w:val="1049"/>
+          <w:numId w:val="1050"/>
         </w:numPr>
       </w:pPr>
       <w:r>
@@ -5962,7 +5982,7 @@
         <w:pStyle w:val="Compact"/>
         <w:numPr>
           <w:ilvl w:val="0"/>
-          <w:numId w:val="1049"/>
+          <w:numId w:val="1050"/>
         </w:numPr>
       </w:pPr>
       <w:r>
@@ -5974,7 +5994,7 @@
         <w:pStyle w:val="Compact"/>
         <w:numPr>
           <w:ilvl w:val="0"/>
-          <w:numId w:val="1049"/>
+          <w:numId w:val="1050"/>
         </w:numPr>
       </w:pPr>
       <w:r>
@@ -6055,7 +6075,7 @@
         <w:pStyle w:val="Compact"/>
         <w:numPr>
           <w:ilvl w:val="0"/>
-          <w:numId w:val="1050"/>
+          <w:numId w:val="1051"/>
         </w:numPr>
       </w:pPr>
       <w:r>
@@ -6067,7 +6087,7 @@
         <w:pStyle w:val="Compact"/>
         <w:numPr>
           <w:ilvl w:val="0"/>
-          <w:numId w:val="1050"/>
+          <w:numId w:val="1051"/>
         </w:numPr>
       </w:pPr>
       <w:r>
@@ -6079,7 +6099,7 @@
         <w:pStyle w:val="Compact"/>
         <w:numPr>
           <w:ilvl w:val="0"/>
-          <w:numId w:val="1050"/>
+          <w:numId w:val="1051"/>
         </w:numPr>
       </w:pPr>
       <w:r>
@@ -6099,7 +6119,7 @@
         <w:pStyle w:val="Compact"/>
         <w:numPr>
           <w:ilvl w:val="0"/>
-          <w:numId w:val="1051"/>
+          <w:numId w:val="1052"/>
         </w:numPr>
       </w:pPr>
       <w:r>
@@ -6142,7 +6162,7 @@
         <w:pStyle w:val="Compact"/>
         <w:numPr>
           <w:ilvl w:val="0"/>
-          <w:numId w:val="1052"/>
+          <w:numId w:val="1053"/>
         </w:numPr>
       </w:pPr>
       <w:r>
@@ -6154,7 +6174,7 @@
         <w:pStyle w:val="Compact"/>
         <w:numPr>
           <w:ilvl w:val="0"/>
-          <w:numId w:val="1052"/>
+          <w:numId w:val="1053"/>
         </w:numPr>
       </w:pPr>
       <w:r>
@@ -6166,7 +6186,7 @@
         <w:pStyle w:val="Compact"/>
         <w:numPr>
           <w:ilvl w:val="0"/>
-          <w:numId w:val="1052"/>
+          <w:numId w:val="1053"/>
         </w:numPr>
       </w:pPr>
       <w:r>
@@ -6178,7 +6198,7 @@
         <w:pStyle w:val="Compact"/>
         <w:numPr>
           <w:ilvl w:val="0"/>
-          <w:numId w:val="1052"/>
+          <w:numId w:val="1053"/>
         </w:numPr>
       </w:pPr>
       <w:r>
@@ -6259,7 +6279,7 @@
         <w:pStyle w:val="Compact"/>
         <w:numPr>
           <w:ilvl w:val="0"/>
-          <w:numId w:val="1053"/>
+          <w:numId w:val="1054"/>
         </w:numPr>
       </w:pPr>
       <w:r>
@@ -6271,7 +6291,7 @@
         <w:pStyle w:val="Compact"/>
         <w:numPr>
           <w:ilvl w:val="0"/>
-          <w:numId w:val="1053"/>
+          <w:numId w:val="1054"/>
         </w:numPr>
       </w:pPr>
       <w:r>
@@ -6291,7 +6311,7 @@
         <w:pStyle w:val="Compact"/>
         <w:numPr>
           <w:ilvl w:val="0"/>
-          <w:numId w:val="1054"/>
+          <w:numId w:val="1055"/>
         </w:numPr>
       </w:pPr>
       <w:r>
@@ -6334,7 +6354,7 @@
         <w:pStyle w:val="Compact"/>
         <w:numPr>
           <w:ilvl w:val="0"/>
-          <w:numId w:val="1055"/>
+          <w:numId w:val="1056"/>
         </w:numPr>
       </w:pPr>
       <w:r>
@@ -6346,7 +6366,7 @@
         <w:pStyle w:val="Compact"/>
         <w:numPr>
           <w:ilvl w:val="0"/>
-          <w:numId w:val="1055"/>
+          <w:numId w:val="1056"/>
         </w:numPr>
       </w:pPr>
       <w:r>
@@ -6358,7 +6378,7 @@
         <w:pStyle w:val="Compact"/>
         <w:numPr>
           <w:ilvl w:val="0"/>
-          <w:numId w:val="1055"/>
+          <w:numId w:val="1056"/>
         </w:numPr>
       </w:pPr>
       <w:r>
@@ -6370,7 +6390,7 @@
         <w:pStyle w:val="Compact"/>
         <w:numPr>
           <w:ilvl w:val="0"/>
-          <w:numId w:val="1055"/>
+          <w:numId w:val="1056"/>
         </w:numPr>
       </w:pPr>
       <w:r>
@@ -6451,7 +6471,7 @@
         <w:pStyle w:val="Compact"/>
         <w:numPr>
           <w:ilvl w:val="0"/>
-          <w:numId w:val="1056"/>
+          <w:numId w:val="1057"/>
         </w:numPr>
       </w:pPr>
       <w:r>
@@ -6463,7 +6483,7 @@
         <w:pStyle w:val="Compact"/>
         <w:numPr>
           <w:ilvl w:val="0"/>
-          <w:numId w:val="1056"/>
+          <w:numId w:val="1057"/>
         </w:numPr>
       </w:pPr>
       <w:r>
@@ -6483,7 +6503,7 @@
         <w:pStyle w:val="Compact"/>
         <w:numPr>
           <w:ilvl w:val="0"/>
-          <w:numId w:val="1057"/>
+          <w:numId w:val="1058"/>
         </w:numPr>
       </w:pPr>
       <w:r>
@@ -6526,7 +6546,7 @@
         <w:pStyle w:val="Compact"/>
         <w:numPr>
           <w:ilvl w:val="0"/>
-          <w:numId w:val="1058"/>
+          <w:numId w:val="1059"/>
         </w:numPr>
       </w:pPr>
       <w:r>
@@ -6538,7 +6558,7 @@
         <w:pStyle w:val="Compact"/>
         <w:numPr>
           <w:ilvl w:val="0"/>
-          <w:numId w:val="1058"/>
+          <w:numId w:val="1059"/>
         </w:numPr>
       </w:pPr>
       <w:r>
@@ -6550,7 +6570,7 @@
         <w:pStyle w:val="Compact"/>
         <w:numPr>
           <w:ilvl w:val="0"/>
-          <w:numId w:val="1058"/>
+          <w:numId w:val="1059"/>
         </w:numPr>
       </w:pPr>
       <w:r>
@@ -6562,7 +6582,7 @@
         <w:pStyle w:val="Compact"/>
         <w:numPr>
           <w:ilvl w:val="0"/>
-          <w:numId w:val="1058"/>
+          <w:numId w:val="1059"/>
         </w:numPr>
       </w:pPr>
       <w:r>
@@ -6746,7 +6766,7 @@
         <w:pStyle w:val="Compact"/>
         <w:numPr>
           <w:ilvl w:val="0"/>
-          <w:numId w:val="1059"/>
+          <w:numId w:val="1060"/>
         </w:numPr>
       </w:pPr>
       <w:r>
@@ -6853,7 +6873,7 @@
         <w:pStyle w:val="Compact"/>
         <w:numPr>
           <w:ilvl w:val="0"/>
-          <w:numId w:val="1060"/>
+          <w:numId w:val="1061"/>
         </w:numPr>
       </w:pPr>
       <w:r>
@@ -6875,7 +6895,7 @@
         <w:pStyle w:val="Compact"/>
         <w:numPr>
           <w:ilvl w:val="0"/>
-          <w:numId w:val="1061"/>
+          <w:numId w:val="1062"/>
         </w:numPr>
       </w:pPr>
       <w:r>
@@ -6887,7 +6907,7 @@
         <w:pStyle w:val="Compact"/>
         <w:numPr>
           <w:ilvl w:val="0"/>
-          <w:numId w:val="1061"/>
+          <w:numId w:val="1062"/>
         </w:numPr>
       </w:pPr>
       <w:r>
@@ -6899,7 +6919,7 @@
         <w:pStyle w:val="Compact"/>
         <w:numPr>
           <w:ilvl w:val="0"/>
-          <w:numId w:val="1061"/>
+          <w:numId w:val="1062"/>
         </w:numPr>
       </w:pPr>
       <w:r>
@@ -6911,7 +6931,7 @@
         <w:pStyle w:val="Compact"/>
         <w:numPr>
           <w:ilvl w:val="0"/>
-          <w:numId w:val="1061"/>
+          <w:numId w:val="1062"/>
         </w:numPr>
       </w:pPr>
       <w:r>
@@ -9213,7 +9233,7 @@
         <w:pStyle w:val="Compact"/>
         <w:numPr>
           <w:ilvl w:val="0"/>
-          <w:numId w:val="1062"/>
+          <w:numId w:val="1063"/>
         </w:numPr>
       </w:pPr>
       <w:r>
@@ -9225,7 +9245,7 @@
         <w:pStyle w:val="Compact"/>
         <w:numPr>
           <w:ilvl w:val="0"/>
-          <w:numId w:val="1062"/>
+          <w:numId w:val="1063"/>
         </w:numPr>
       </w:pPr>
       <w:r>
@@ -10662,9 +10682,39 @@
     <w:abstractNumId w:val="991"/>
   </w:num>
   <w:num w:numId="1045">
+    <w:abstractNumId w:val="99411"/>
+    <w:lvlOverride w:ilvl="0">
+      <w:startOverride w:val="1"/>
+    </w:lvlOverride>
+    <w:lvlOverride w:ilvl="1">
+      <w:startOverride w:val="1"/>
+    </w:lvlOverride>
+    <w:lvlOverride w:ilvl="2">
+      <w:startOverride w:val="1"/>
+    </w:lvlOverride>
+    <w:lvlOverride w:ilvl="3">
+      <w:startOverride w:val="1"/>
+    </w:lvlOverride>
+    <w:lvlOverride w:ilvl="4">
+      <w:startOverride w:val="1"/>
+    </w:lvlOverride>
+    <w:lvlOverride w:ilvl="5">
+      <w:startOverride w:val="1"/>
+    </w:lvlOverride>
+    <w:lvlOverride w:ilvl="6">
+      <w:startOverride w:val="1"/>
+    </w:lvlOverride>
+    <w:lvlOverride w:ilvl="7">
+      <w:startOverride w:val="1"/>
+    </w:lvlOverride>
+    <w:lvlOverride w:ilvl="8">
+      <w:startOverride w:val="1"/>
+    </w:lvlOverride>
+  </w:num>
+  <w:num w:numId="1046">
     <w:abstractNumId w:val="991"/>
   </w:num>
-  <w:num w:numId="1046">
+  <w:num w:numId="1047">
     <w:abstractNumId w:val="99411"/>
     <w:lvlOverride w:ilvl="0">
       <w:startOverride w:val="1"/>
@@ -10694,10 +10744,10 @@
       <w:startOverride w:val="1"/>
     </w:lvlOverride>
   </w:num>
-  <w:num w:numId="1047">
+  <w:num w:numId="1048">
     <w:abstractNumId w:val="991"/>
   </w:num>
-  <w:num w:numId="1048">
+  <w:num w:numId="1049">
     <w:abstractNumId w:val="99411"/>
     <w:lvlOverride w:ilvl="0">
       <w:startOverride w:val="1"/>
@@ -10726,14 +10776,14 @@
     <w:lvlOverride w:ilvl="8">
       <w:startOverride w:val="1"/>
     </w:lvlOverride>
-  </w:num>
-  <w:num w:numId="1049">
-    <w:abstractNumId w:val="991"/>
   </w:num>
   <w:num w:numId="1050">
     <w:abstractNumId w:val="991"/>
   </w:num>
   <w:num w:numId="1051">
+    <w:abstractNumId w:val="991"/>
+  </w:num>
+  <w:num w:numId="1052">
     <w:abstractNumId w:val="99411"/>
     <w:lvlOverride w:ilvl="0">
       <w:startOverride w:val="1"/>
@@ -10762,14 +10812,14 @@
     <w:lvlOverride w:ilvl="8">
       <w:startOverride w:val="1"/>
     </w:lvlOverride>
-  </w:num>
-  <w:num w:numId="1052">
-    <w:abstractNumId w:val="991"/>
   </w:num>
   <w:num w:numId="1053">
     <w:abstractNumId w:val="991"/>
   </w:num>
   <w:num w:numId="1054">
+    <w:abstractNumId w:val="991"/>
+  </w:num>
+  <w:num w:numId="1055">
     <w:abstractNumId w:val="99411"/>
     <w:lvlOverride w:ilvl="0">
       <w:startOverride w:val="1"/>
@@ -10798,14 +10848,14 @@
     <w:lvlOverride w:ilvl="8">
       <w:startOverride w:val="1"/>
     </w:lvlOverride>
-  </w:num>
-  <w:num w:numId="1055">
-    <w:abstractNumId w:val="991"/>
   </w:num>
   <w:num w:numId="1056">
     <w:abstractNumId w:val="991"/>
   </w:num>
   <w:num w:numId="1057">
+    <w:abstractNumId w:val="991"/>
+  </w:num>
+  <w:num w:numId="1058">
     <w:abstractNumId w:val="99411"/>
     <w:lvlOverride w:ilvl="0">
       <w:startOverride w:val="1"/>
@@ -10835,38 +10885,8 @@
       <w:startOverride w:val="1"/>
     </w:lvlOverride>
   </w:num>
-  <w:num w:numId="1058">
+  <w:num w:numId="1059">
     <w:abstractNumId w:val="991"/>
-  </w:num>
-  <w:num w:numId="1059">
-    <w:abstractNumId w:val="99411"/>
-    <w:lvlOverride w:ilvl="0">
-      <w:startOverride w:val="1"/>
-    </w:lvlOverride>
-    <w:lvlOverride w:ilvl="1">
-      <w:startOverride w:val="1"/>
-    </w:lvlOverride>
-    <w:lvlOverride w:ilvl="2">
-      <w:startOverride w:val="1"/>
-    </w:lvlOverride>
-    <w:lvlOverride w:ilvl="3">
-      <w:startOverride w:val="1"/>
-    </w:lvlOverride>
-    <w:lvlOverride w:ilvl="4">
-      <w:startOverride w:val="1"/>
-    </w:lvlOverride>
-    <w:lvlOverride w:ilvl="5">
-      <w:startOverride w:val="1"/>
-    </w:lvlOverride>
-    <w:lvlOverride w:ilvl="6">
-      <w:startOverride w:val="1"/>
-    </w:lvlOverride>
-    <w:lvlOverride w:ilvl="7">
-      <w:startOverride w:val="1"/>
-    </w:lvlOverride>
-    <w:lvlOverride w:ilvl="8">
-      <w:startOverride w:val="1"/>
-    </w:lvlOverride>
   </w:num>
   <w:num w:numId="1060">
     <w:abstractNumId w:val="99411"/>
@@ -10899,9 +10919,39 @@
     </w:lvlOverride>
   </w:num>
   <w:num w:numId="1061">
+    <w:abstractNumId w:val="99411"/>
+    <w:lvlOverride w:ilvl="0">
+      <w:startOverride w:val="1"/>
+    </w:lvlOverride>
+    <w:lvlOverride w:ilvl="1">
+      <w:startOverride w:val="1"/>
+    </w:lvlOverride>
+    <w:lvlOverride w:ilvl="2">
+      <w:startOverride w:val="1"/>
+    </w:lvlOverride>
+    <w:lvlOverride w:ilvl="3">
+      <w:startOverride w:val="1"/>
+    </w:lvlOverride>
+    <w:lvlOverride w:ilvl="4">
+      <w:startOverride w:val="1"/>
+    </w:lvlOverride>
+    <w:lvlOverride w:ilvl="5">
+      <w:startOverride w:val="1"/>
+    </w:lvlOverride>
+    <w:lvlOverride w:ilvl="6">
+      <w:startOverride w:val="1"/>
+    </w:lvlOverride>
+    <w:lvlOverride w:ilvl="7">
+      <w:startOverride w:val="1"/>
+    </w:lvlOverride>
+    <w:lvlOverride w:ilvl="8">
+      <w:startOverride w:val="1"/>
+    </w:lvlOverride>
+  </w:num>
+  <w:num w:numId="1062">
     <w:abstractNumId w:val="991"/>
   </w:num>
-  <w:num w:numId="1062">
+  <w:num w:numId="1063">
     <w:abstractNumId w:val="991"/>
   </w:num>
 </w:numbering>

</xml_diff>

<commit_message>
Deploy latest version of PFS documents 11040b8a5414305ccea81c590302a12e1eed8b58
</commit_message>
<xml_diff>
--- a/latest/NLSR.docx
+++ b/latest/NLSR.docx
@@ -123,18 +123,6 @@
     </w:p>
     <w:p>
       <w:pPr>
-        <w:pStyle w:val="FirstParagraph"/>
-      </w:pPr>
-      <w:r>
-        <w:rPr>
-          <w:b/>
-          <w:bCs/>
-        </w:rPr>
-        <w:t xml:space="preserve">This is a breaking change!</w:t>
-      </w:r>
-    </w:p>
-    <w:p>
-      <w:pPr>
         <w:pStyle w:val="Compact"/>
         <w:numPr>
           <w:ilvl w:val="0"/>
@@ -179,30 +167,6 @@
       </w:pPr>
       <w:r>
         <w:t xml:space="preserve">Numerical identifiers were rotated and are deprecated; new textual identifiers have been added</w:t>
-      </w:r>
-    </w:p>
-    <w:p>
-      <w:pPr>
-        <w:pStyle w:val="Compact"/>
-        <w:numPr>
-          <w:ilvl w:val="0"/>
-          <w:numId w:val="1001"/>
-        </w:numPr>
-      </w:pPr>
-      <w:r>
-        <w:t xml:space="preserve">The requirement</w:t>
-      </w:r>
-      <w:r>
-        <w:t xml:space="preserve"> </w:t>
-      </w:r>
-      <w:r>
-        <w:t xml:space="preserve">“Cloud optimized file formats are recommended.”</w:t>
-      </w:r>
-      <w:r>
-        <w:t xml:space="preserve"> </w:t>
-      </w:r>
-      <w:r>
-        <w:t xml:space="preserve">has been moved from the category description to a separate requirement.</w:t>
       </w:r>
     </w:p>
     <w:p>

</xml_diff>

<commit_message>
Deploy latest version of PFS documents 6d7c6fbcac4561e7fed8cc19e739e66492a0cef3
</commit_message>
<xml_diff>
--- a/latest/NLSR.docx
+++ b/latest/NLSR.docx
@@ -11,18 +11,18 @@
           <wp:inline>
             <wp:extent cx="5727700" cy="1381957"/>
             <wp:effectExtent b="0" l="0" r="0" t="0"/>
-            <wp:docPr descr="" title="" id="21" name="Picture"/>
+            <wp:docPr descr="" title="" id="24" name="Picture"/>
             <a:graphic>
               <a:graphicData uri="http://schemas.openxmlformats.org/drawingml/2006/picture">
                 <pic:pic>
                   <pic:nvPicPr>
-                    <pic:cNvPr descr="assets/CEOS_logo_colour_black_text_right.png" id="22" name="Picture"/>
+                    <pic:cNvPr descr="assets/CEOS_logo_colour_black_text_right.png" id="25" name="Picture"/>
                     <pic:cNvPicPr>
                       <a:picLocks noChangeArrowheads="1" noChangeAspect="1"/>
                     </pic:cNvPicPr>
                   </pic:nvPicPr>
                   <pic:blipFill>
-                    <a:blip r:embed="rId20"/>
+                    <a:blip r:embed="rId23"/>
                     <a:stretch>
                       <a:fillRect/>
                     </a:stretch>
@@ -49,7 +49,7 @@
         </w:drawing>
       </w:r>
     </w:p>
-    <w:bookmarkStart w:id="216" w:name="Xace07e6e84a20a798737796089e457c2649c17a"/>
+    <w:bookmarkStart w:id="219" w:name="Xace07e6e84a20a798737796089e457c2649c17a"/>
     <w:p>
       <w:pPr>
         <w:pStyle w:val="berschrift1"/>
@@ -66,7 +66,7 @@
         <w:t xml:space="preserve"> </w:t>
       </w:r>
     </w:p>
-    <w:bookmarkStart w:id="24" w:name="draft-version"/>
+    <w:bookmarkStart w:id="27" w:name="draft-version"/>
     <w:p>
       <w:pPr>
         <w:pStyle w:val="berschrift2"/>
@@ -91,7 +91,7 @@
       <w:r>
         <w:t xml:space="preserve"> </w:t>
       </w:r>
-      <w:hyperlink r:id="rId23">
+      <w:hyperlink r:id="rId26">
         <w:r>
           <w:rPr>
             <w:rStyle w:val="Hyperlink"/>
@@ -106,8 +106,8 @@
         <w:t xml:space="preserve">for the latest endorsed version of this document.</w:t>
       </w:r>
     </w:p>
-    <w:bookmarkEnd w:id="24"/>
-    <w:bookmarkStart w:id="26" w:name="document-status"/>
+    <w:bookmarkEnd w:id="27"/>
+    <w:bookmarkStart w:id="29" w:name="document-status"/>
     <w:p>
       <w:pPr>
         <w:pStyle w:val="berschrift2"/>
@@ -134,7 +134,7 @@
       <w:r>
         <w:t xml:space="preserve"> </w:t>
       </w:r>
-      <w:hyperlink r:id="rId25">
+      <w:hyperlink r:id="rId28">
         <w:r>
           <w:rPr>
             <w:rStyle w:val="Hyperlink"/>
@@ -143,8 +143,8 @@
         </w:r>
       </w:hyperlink>
     </w:p>
-    <w:bookmarkEnd w:id="26"/>
-    <w:bookmarkStart w:id="28" w:name="document-history"/>
+    <w:bookmarkEnd w:id="29"/>
+    <w:bookmarkStart w:id="31" w:name="document-history"/>
     <w:p>
       <w:pPr>
         <w:pStyle w:val="berschrift2"/>
@@ -153,7 +153,7 @@
         <w:t xml:space="preserve">Document History</w:t>
       </w:r>
     </w:p>
-    <w:bookmarkStart w:id="27" w:name="patch"/>
+    <w:bookmarkStart w:id="30" w:name="patch"/>
     <w:p>
       <w:pPr>
         <w:pStyle w:val="berschrift3"/>
@@ -294,9 +294,9 @@
         <w:t xml:space="preserve">Matthias Mohr</w:t>
       </w:r>
     </w:p>
-    <w:bookmarkEnd w:id="27"/>
-    <w:bookmarkEnd w:id="28"/>
-    <w:bookmarkStart w:id="29" w:name="contributing-authors"/>
+    <w:bookmarkEnd w:id="30"/>
+    <w:bookmarkEnd w:id="31"/>
+    <w:bookmarkStart w:id="32" w:name="contributing-authors"/>
     <w:p>
       <w:pPr>
         <w:pStyle w:val="berschrift2"/>
@@ -358,8 +358,8 @@
         <w:br w:type="page"/>
       </w:r>
     </w:p>
-    <w:bookmarkEnd w:id="29"/>
-    <w:bookmarkStart w:id="30" w:name="ceos-analysis-ready-data-definition"/>
+    <w:bookmarkEnd w:id="32"/>
+    <w:bookmarkStart w:id="33" w:name="ceos-analysis-ready-data-definition"/>
     <w:p>
       <w:pPr>
         <w:pStyle w:val="berschrift2"/>
@@ -376,8 +376,8 @@
         <w:t xml:space="preserve">CEOS Analysis Ready Data (CEOS-ARD) are satellite data that have been processed to a minimum set of requirements and organized into a form that allows immediate analysis with a minimum of additional user effort and interoperability both through time and with other datasets.</w:t>
       </w:r>
     </w:p>
-    <w:bookmarkEnd w:id="30"/>
-    <w:bookmarkStart w:id="31" w:name="description"/>
+    <w:bookmarkEnd w:id="33"/>
+    <w:bookmarkStart w:id="34" w:name="description"/>
     <w:p>
       <w:pPr>
         <w:pStyle w:val="berschrift2"/>
@@ -440,8 +440,8 @@
         <w:t xml:space="preserve">Data collected by Synthetic Aperture Radar sensors</w:t>
       </w:r>
     </w:p>
-    <w:bookmarkEnd w:id="31"/>
-    <w:bookmarkStart w:id="32" w:name="background"/>
+    <w:bookmarkEnd w:id="34"/>
+    <w:bookmarkStart w:id="35" w:name="background"/>
     <w:p>
       <w:pPr>
         <w:pStyle w:val="berschrift2"/>
@@ -475,8 +475,8 @@
         <w:br w:type="page"/>
       </w:r>
     </w:p>
-    <w:bookmarkEnd w:id="32"/>
-    <w:bookmarkStart w:id="33" w:name="definitions-and-abbreviations"/>
+    <w:bookmarkEnd w:id="35"/>
+    <w:bookmarkStart w:id="36" w:name="definitions-and-abbreviations"/>
     <w:p>
       <w:pPr>
         <w:pStyle w:val="berschrift2"/>
@@ -730,8 +730,8 @@
         <w:br w:type="page"/>
       </w:r>
     </w:p>
-    <w:bookmarkEnd w:id="33"/>
-    <w:bookmarkStart w:id="194" w:name="requirements"/>
+    <w:bookmarkEnd w:id="36"/>
+    <w:bookmarkStart w:id="197" w:name="requirements"/>
     <w:p>
       <w:pPr>
         <w:pStyle w:val="berschrift2"/>
@@ -786,7 +786,7 @@
         <w:t xml:space="preserve">Instead, use the textual identifier that is provided below the title.</w:t>
       </w:r>
     </w:p>
-    <w:bookmarkStart w:id="102" w:name="sec:meta"/>
+    <w:bookmarkStart w:id="105" w:name="sec:meta"/>
     <w:p>
       <w:pPr>
         <w:pStyle w:val="berschrift3"/>
@@ -840,7 +840,7 @@
         <w:t xml:space="preserve">suitability of the dataset, and must meet the requirements listed below.</w:t>
       </w:r>
     </w:p>
-    <w:bookmarkStart w:id="37" w:name="sec:meta-trace-sr"/>
+    <w:bookmarkStart w:id="40" w:name="sec:meta-trace-sr"/>
     <w:p>
       <w:pPr>
         <w:pStyle w:val="berschrift4"/>
@@ -875,7 +875,7 @@
         <w:t xml:space="preserve">meta-trace-sr</w:t>
       </w:r>
     </w:p>
-    <w:bookmarkStart w:id="34" w:name="threshold-requirements"/>
+    <w:bookmarkStart w:id="37" w:name="threshold-requirements"/>
     <w:p>
       <w:pPr>
         <w:pStyle w:val="berschrift5"/>
@@ -895,8 +895,8 @@
         <w:t xml:space="preserve"> </w:t>
       </w:r>
     </w:p>
-    <w:bookmarkEnd w:id="34"/>
-    <w:bookmarkStart w:id="35" w:name="goal-requirements"/>
+    <w:bookmarkEnd w:id="37"/>
+    <w:bookmarkStart w:id="38" w:name="goal-requirements"/>
     <w:p>
       <w:pPr>
         <w:pStyle w:val="berschrift5"/>
@@ -962,8 +962,8 @@
         <w:t xml:space="preserve">Information on traceability should be available in the metadata as a single DOI landing page.</w:t>
       </w:r>
     </w:p>
-    <w:bookmarkEnd w:id="35"/>
-    <w:bookmarkStart w:id="36" w:name="assessment"/>
+    <w:bookmarkEnd w:id="38"/>
+    <w:bookmarkStart w:id="39" w:name="assessment"/>
     <w:p>
       <w:pPr>
         <w:pStyle w:val="berschrift5"/>
@@ -1027,9 +1027,9 @@
         </w:pict>
       </w:r>
     </w:p>
-    <w:bookmarkEnd w:id="36"/>
-    <w:bookmarkEnd w:id="37"/>
-    <w:bookmarkStart w:id="41" w:name="sec:meta-memare-optical"/>
+    <w:bookmarkEnd w:id="39"/>
+    <w:bookmarkEnd w:id="40"/>
+    <w:bookmarkStart w:id="44" w:name="sec:meta-memare-optical"/>
     <w:p>
       <w:pPr>
         <w:pStyle w:val="berschrift4"/>
@@ -1064,7 +1064,7 @@
         <w:t xml:space="preserve">meta-memare-optical</w:t>
       </w:r>
     </w:p>
-    <w:bookmarkStart w:id="38" w:name="threshold-requirements-1"/>
+    <w:bookmarkStart w:id="41" w:name="threshold-requirements-1"/>
     <w:p>
       <w:pPr>
         <w:pStyle w:val="berschrift5"/>
@@ -1081,8 +1081,8 @@
         <w:t xml:space="preserve">Metadata is provided in a structure that enables a computer algorithm to be used to consistently and automatically identify and extract each component part for further use.</w:t>
       </w:r>
     </w:p>
-    <w:bookmarkEnd w:id="38"/>
-    <w:bookmarkStart w:id="39" w:name="goal-requirements-1"/>
+    <w:bookmarkEnd w:id="41"/>
+    <w:bookmarkStart w:id="42" w:name="goal-requirements-1"/>
     <w:p>
       <w:pPr>
         <w:pStyle w:val="berschrift5"/>
@@ -1099,8 +1099,8 @@
         <w:t xml:space="preserve">As threshold, but metadata should be provided in a community endorsed standard that facilitates machine-readability, such as ISO 19115-2.</w:t>
       </w:r>
     </w:p>
-    <w:bookmarkEnd w:id="39"/>
-    <w:bookmarkStart w:id="40" w:name="assessment-1"/>
+    <w:bookmarkEnd w:id="42"/>
+    <w:bookmarkStart w:id="43" w:name="assessment-1"/>
     <w:p>
       <w:pPr>
         <w:pStyle w:val="berschrift5"/>
@@ -1164,9 +1164,9 @@
         </w:pict>
       </w:r>
     </w:p>
-    <w:bookmarkEnd w:id="40"/>
-    <w:bookmarkEnd w:id="41"/>
-    <w:bookmarkStart w:id="45" w:name="sec:meta-time-sr"/>
+    <w:bookmarkEnd w:id="43"/>
+    <w:bookmarkEnd w:id="44"/>
+    <w:bookmarkStart w:id="48" w:name="sec:meta-time-sr"/>
     <w:p>
       <w:pPr>
         <w:pStyle w:val="berschrift4"/>
@@ -1201,7 +1201,7 @@
         <w:t xml:space="preserve">meta-time-sr</w:t>
       </w:r>
     </w:p>
-    <w:bookmarkStart w:id="42" w:name="threshold-requirements-2"/>
+    <w:bookmarkStart w:id="45" w:name="threshold-requirements-2"/>
     <w:p>
       <w:pPr>
         <w:pStyle w:val="berschrift5"/>
@@ -1218,8 +1218,8 @@
         <w:t xml:space="preserve">The data collection time is identified in the metadata, expressed in date/time, to the second, with the time offset from UTC unambiguously identified.</w:t>
       </w:r>
     </w:p>
-    <w:bookmarkEnd w:id="42"/>
-    <w:bookmarkStart w:id="43" w:name="goal-requirements-2"/>
+    <w:bookmarkEnd w:id="45"/>
+    <w:bookmarkStart w:id="46" w:name="goal-requirements-2"/>
     <w:p>
       <w:pPr>
         <w:pStyle w:val="berschrift5"/>
@@ -1236,8 +1236,8 @@
         <w:t xml:space="preserve">Acquisition time for each pixel is identified (or can be reliably determined) in the metadata, expressed in date/time at UTC, to the second.</w:t>
       </w:r>
     </w:p>
-    <w:bookmarkEnd w:id="43"/>
-    <w:bookmarkStart w:id="44" w:name="assessment-2"/>
+    <w:bookmarkEnd w:id="46"/>
+    <w:bookmarkStart w:id="47" w:name="assessment-2"/>
     <w:p>
       <w:pPr>
         <w:pStyle w:val="berschrift5"/>
@@ -1301,9 +1301,9 @@
         </w:pict>
       </w:r>
     </w:p>
-    <w:bookmarkEnd w:id="44"/>
-    <w:bookmarkEnd w:id="45"/>
-    <w:bookmarkStart w:id="49" w:name="sec:meta-geoarea-optical"/>
+    <w:bookmarkEnd w:id="47"/>
+    <w:bookmarkEnd w:id="48"/>
+    <w:bookmarkStart w:id="52" w:name="sec:meta-geoarea-optical"/>
     <w:p>
       <w:pPr>
         <w:pStyle w:val="berschrift4"/>
@@ -1338,7 +1338,7 @@
         <w:t xml:space="preserve">meta-geoarea-optical</w:t>
       </w:r>
     </w:p>
-    <w:bookmarkStart w:id="46" w:name="threshold-requirements-3"/>
+    <w:bookmarkStart w:id="49" w:name="threshold-requirements-3"/>
     <w:p>
       <w:pPr>
         <w:pStyle w:val="berschrift5"/>
@@ -1355,8 +1355,8 @@
         <w:t xml:space="preserve">The surface location to which the data relates is identified, typically as a series of four corner points, expressed in an accepted coordinate reference system (e.g., WGS84).</w:t>
       </w:r>
     </w:p>
-    <w:bookmarkEnd w:id="46"/>
-    <w:bookmarkStart w:id="47" w:name="goal-requirements-3"/>
+    <w:bookmarkEnd w:id="49"/>
+    <w:bookmarkStart w:id="50" w:name="goal-requirements-3"/>
     <w:p>
       <w:pPr>
         <w:pStyle w:val="berschrift5"/>
@@ -1373,8 +1373,8 @@
         <w:t xml:space="preserve">The geographic area covered by the observations is identified specifically, such as through a set of coordinates of a closely bounding polygon. The location to which each pixel refers is identified (or can be reliably determined) with the projection system (if any) and reference datum provided.</w:t>
       </w:r>
     </w:p>
-    <w:bookmarkEnd w:id="47"/>
-    <w:bookmarkStart w:id="48" w:name="assessment-3"/>
+    <w:bookmarkEnd w:id="50"/>
+    <w:bookmarkStart w:id="51" w:name="assessment-3"/>
     <w:p>
       <w:pPr>
         <w:pStyle w:val="berschrift5"/>
@@ -1438,9 +1438,9 @@
         </w:pict>
       </w:r>
     </w:p>
-    <w:bookmarkEnd w:id="48"/>
-    <w:bookmarkEnd w:id="49"/>
-    <w:bookmarkStart w:id="53" w:name="sec:meta-crs-optical"/>
+    <w:bookmarkEnd w:id="51"/>
+    <w:bookmarkEnd w:id="52"/>
+    <w:bookmarkStart w:id="56" w:name="sec:meta-crs-optical"/>
     <w:p>
       <w:pPr>
         <w:pStyle w:val="berschrift4"/>
@@ -1475,7 +1475,7 @@
         <w:t xml:space="preserve">meta-crs-optical</w:t>
       </w:r>
     </w:p>
-    <w:bookmarkStart w:id="50" w:name="threshold-requirements-4"/>
+    <w:bookmarkStart w:id="53" w:name="threshold-requirements-4"/>
     <w:p>
       <w:pPr>
         <w:pStyle w:val="berschrift5"/>
@@ -1492,8 +1492,8 @@
         <w:t xml:space="preserve">The metadata lists the coordinate reference system that has been used.</w:t>
       </w:r>
     </w:p>
-    <w:bookmarkEnd w:id="50"/>
-    <w:bookmarkStart w:id="51" w:name="goal-requirements-4"/>
+    <w:bookmarkEnd w:id="53"/>
+    <w:bookmarkStart w:id="54" w:name="goal-requirements-4"/>
     <w:p>
       <w:pPr>
         <w:pStyle w:val="berschrift5"/>
@@ -1513,8 +1513,8 @@
         <w:t xml:space="preserve"> </w:t>
       </w:r>
     </w:p>
-    <w:bookmarkEnd w:id="51"/>
-    <w:bookmarkStart w:id="52" w:name="assessment-4"/>
+    <w:bookmarkEnd w:id="54"/>
+    <w:bookmarkStart w:id="55" w:name="assessment-4"/>
     <w:p>
       <w:pPr>
         <w:pStyle w:val="berschrift5"/>
@@ -1578,9 +1578,9 @@
         </w:pict>
       </w:r>
     </w:p>
-    <w:bookmarkEnd w:id="52"/>
-    <w:bookmarkEnd w:id="53"/>
-    <w:bookmarkStart w:id="57" w:name="sec:meta-mapproj-nlsr"/>
+    <w:bookmarkEnd w:id="55"/>
+    <w:bookmarkEnd w:id="56"/>
+    <w:bookmarkStart w:id="60" w:name="sec:meta-mapproj-nlsr"/>
     <w:p>
       <w:pPr>
         <w:pStyle w:val="berschrift4"/>
@@ -1615,7 +1615,7 @@
         <w:t xml:space="preserve">meta-mapproj-nlsr</w:t>
       </w:r>
     </w:p>
-    <w:bookmarkStart w:id="54" w:name="threshold-requirements-5"/>
+    <w:bookmarkStart w:id="57" w:name="threshold-requirements-5"/>
     <w:p>
       <w:pPr>
         <w:pStyle w:val="berschrift5"/>
@@ -1632,8 +1632,8 @@
         <w:t xml:space="preserve">The metadata lists the map projection that has been used and any relevant parameters required in relation to use of data in that map projection.</w:t>
       </w:r>
     </w:p>
-    <w:bookmarkEnd w:id="54"/>
-    <w:bookmarkStart w:id="55" w:name="goal-requirements-5"/>
+    <w:bookmarkEnd w:id="57"/>
+    <w:bookmarkStart w:id="58" w:name="goal-requirements-5"/>
     <w:p>
       <w:pPr>
         <w:pStyle w:val="berschrift5"/>
@@ -1653,8 +1653,8 @@
         <w:t xml:space="preserve"> </w:t>
       </w:r>
     </w:p>
-    <w:bookmarkEnd w:id="55"/>
-    <w:bookmarkStart w:id="56" w:name="assessment-5"/>
+    <w:bookmarkEnd w:id="58"/>
+    <w:bookmarkStart w:id="59" w:name="assessment-5"/>
     <w:p>
       <w:pPr>
         <w:pStyle w:val="berschrift5"/>
@@ -1718,9 +1718,9 @@
         </w:pict>
       </w:r>
     </w:p>
-    <w:bookmarkEnd w:id="56"/>
-    <w:bookmarkEnd w:id="57"/>
-    <w:bookmarkStart w:id="61" w:name="sec:meta-geocorm-sr"/>
+    <w:bookmarkEnd w:id="59"/>
+    <w:bookmarkEnd w:id="60"/>
+    <w:bookmarkStart w:id="64" w:name="sec:meta-geocorm-sr"/>
     <w:p>
       <w:pPr>
         <w:pStyle w:val="berschrift4"/>
@@ -1755,7 +1755,7 @@
         <w:t xml:space="preserve">meta-geocorm-sr</w:t>
       </w:r>
     </w:p>
-    <w:bookmarkStart w:id="58" w:name="threshold-requirements-6"/>
+    <w:bookmarkStart w:id="61" w:name="threshold-requirements-6"/>
     <w:p>
       <w:pPr>
         <w:pStyle w:val="berschrift5"/>
@@ -1775,8 +1775,8 @@
         <w:t xml:space="preserve"> </w:t>
       </w:r>
     </w:p>
-    <w:bookmarkEnd w:id="58"/>
-    <w:bookmarkStart w:id="59" w:name="goal-requirements-6"/>
+    <w:bookmarkEnd w:id="61"/>
+    <w:bookmarkStart w:id="62" w:name="goal-requirements-6"/>
     <w:p>
       <w:pPr>
         <w:pStyle w:val="berschrift5"/>
@@ -1793,8 +1793,8 @@
         <w:t xml:space="preserve">Information on geometric correction methods should be available in the metadata as a single DOI landing page, including reference database and auxiliary data such as elevation model(s) and reference chip-sets.</w:t>
       </w:r>
     </w:p>
-    <w:bookmarkEnd w:id="59"/>
-    <w:bookmarkStart w:id="60" w:name="assessment-6"/>
+    <w:bookmarkEnd w:id="62"/>
+    <w:bookmarkStart w:id="63" w:name="assessment-6"/>
     <w:p>
       <w:pPr>
         <w:pStyle w:val="berschrift5"/>
@@ -1858,9 +1858,9 @@
         </w:pict>
       </w:r>
     </w:p>
-    <w:bookmarkEnd w:id="60"/>
-    <w:bookmarkEnd w:id="61"/>
-    <w:bookmarkStart w:id="65" w:name="sec:meta-geoacc-sr"/>
+    <w:bookmarkEnd w:id="63"/>
+    <w:bookmarkEnd w:id="64"/>
+    <w:bookmarkStart w:id="68" w:name="sec:meta-geoacc-sr"/>
     <w:p>
       <w:pPr>
         <w:pStyle w:val="berschrift4"/>
@@ -1895,7 +1895,7 @@
         <w:t xml:space="preserve">meta-geoacc-sr</w:t>
       </w:r>
     </w:p>
-    <w:bookmarkStart w:id="62" w:name="threshold-requirements-7"/>
+    <w:bookmarkStart w:id="65" w:name="threshold-requirements-7"/>
     <w:p>
       <w:pPr>
         <w:pStyle w:val="berschrift5"/>
@@ -1915,8 +1915,8 @@
         <w:t xml:space="preserve"> </w:t>
       </w:r>
     </w:p>
-    <w:bookmarkEnd w:id="62"/>
-    <w:bookmarkStart w:id="63" w:name="goal-requirements-7"/>
+    <w:bookmarkEnd w:id="65"/>
+    <w:bookmarkStart w:id="66" w:name="goal-requirements-7"/>
     <w:p>
       <w:pPr>
         <w:pStyle w:val="berschrift5"/>
@@ -1965,8 +1965,8 @@
         <w:t xml:space="preserve">Information on geometric accuracy of the data should be available in the metadata as a single DOI landing page.</w:t>
       </w:r>
     </w:p>
-    <w:bookmarkEnd w:id="63"/>
-    <w:bookmarkStart w:id="64" w:name="assessment-7"/>
+    <w:bookmarkEnd w:id="66"/>
+    <w:bookmarkStart w:id="67" w:name="assessment-7"/>
     <w:p>
       <w:pPr>
         <w:pStyle w:val="berschrift5"/>
@@ -2030,9 +2030,9 @@
         </w:pict>
       </w:r>
     </w:p>
-    <w:bookmarkEnd w:id="64"/>
-    <w:bookmarkEnd w:id="65"/>
-    <w:bookmarkStart w:id="69" w:name="sec:meta-instru-optical"/>
+    <w:bookmarkEnd w:id="67"/>
+    <w:bookmarkEnd w:id="68"/>
+    <w:bookmarkStart w:id="72" w:name="sec:meta-instru-optical"/>
     <w:p>
       <w:pPr>
         <w:pStyle w:val="berschrift4"/>
@@ -2067,7 +2067,7 @@
         <w:t xml:space="preserve">meta-instru-optical</w:t>
       </w:r>
     </w:p>
-    <w:bookmarkStart w:id="66" w:name="threshold-requirements-8"/>
+    <w:bookmarkStart w:id="69" w:name="threshold-requirements-8"/>
     <w:p>
       <w:pPr>
         <w:pStyle w:val="berschrift5"/>
@@ -2084,8 +2084,8 @@
         <w:t xml:space="preserve">The instrument used to collect the data is identified in the metadata.</w:t>
       </w:r>
     </w:p>
-    <w:bookmarkEnd w:id="66"/>
-    <w:bookmarkStart w:id="67" w:name="goal-requirements-8"/>
+    <w:bookmarkEnd w:id="69"/>
+    <w:bookmarkStart w:id="70" w:name="goal-requirements-8"/>
     <w:p>
       <w:pPr>
         <w:pStyle w:val="berschrift5"/>
@@ -2102,8 +2102,8 @@
         <w:t xml:space="preserve">As threshold, but information should be available in the metadata as a single DOI landing page with references to the relevant CEOS Missions, Instruments, and Measurements Database record.</w:t>
       </w:r>
     </w:p>
-    <w:bookmarkEnd w:id="67"/>
-    <w:bookmarkStart w:id="68" w:name="assessment-8"/>
+    <w:bookmarkEnd w:id="70"/>
+    <w:bookmarkStart w:id="71" w:name="assessment-8"/>
     <w:p>
       <w:pPr>
         <w:pStyle w:val="berschrift5"/>
@@ -2167,9 +2167,9 @@
         </w:pict>
       </w:r>
     </w:p>
-    <w:bookmarkEnd w:id="68"/>
-    <w:bookmarkEnd w:id="69"/>
-    <w:bookmarkStart w:id="73" w:name="sec:meta-specband"/>
+    <w:bookmarkEnd w:id="71"/>
+    <w:bookmarkEnd w:id="72"/>
+    <w:bookmarkStart w:id="76" w:name="sec:meta-specband"/>
     <w:p>
       <w:pPr>
         <w:pStyle w:val="berschrift4"/>
@@ -2204,7 +2204,7 @@
         <w:t xml:space="preserve">meta-specband</w:t>
       </w:r>
     </w:p>
-    <w:bookmarkStart w:id="70" w:name="threshold-requirements-9"/>
+    <w:bookmarkStart w:id="73" w:name="threshold-requirements-9"/>
     <w:p>
       <w:pPr>
         <w:pStyle w:val="berschrift5"/>
@@ -2221,8 +2221,8 @@
         <w:t xml:space="preserve">The central wavelength for each band for which data is included is identified in the metadata, expressed in SI units.</w:t>
       </w:r>
     </w:p>
-    <w:bookmarkEnd w:id="70"/>
-    <w:bookmarkStart w:id="71" w:name="goal-requirements-9"/>
+    <w:bookmarkEnd w:id="73"/>
+    <w:bookmarkStart w:id="74" w:name="goal-requirements-9"/>
     <w:p>
       <w:pPr>
         <w:pStyle w:val="berschrift5"/>
@@ -2265,8 +2265,8 @@
         <w:t xml:space="preserve">Information on spectral bands should be available in the metadata as a single DOI landing page.</w:t>
       </w:r>
     </w:p>
-    <w:bookmarkEnd w:id="71"/>
-    <w:bookmarkStart w:id="72" w:name="assessment-9"/>
+    <w:bookmarkEnd w:id="74"/>
+    <w:bookmarkStart w:id="75" w:name="assessment-9"/>
     <w:p>
       <w:pPr>
         <w:pStyle w:val="berschrift5"/>
@@ -2330,9 +2330,9 @@
         </w:pict>
       </w:r>
     </w:p>
-    <w:bookmarkEnd w:id="72"/>
-    <w:bookmarkEnd w:id="73"/>
-    <w:bookmarkStart w:id="77" w:name="sec:meta-sencal-optical"/>
+    <w:bookmarkEnd w:id="75"/>
+    <w:bookmarkEnd w:id="76"/>
+    <w:bookmarkStart w:id="80" w:name="sec:meta-sencal-optical"/>
     <w:p>
       <w:pPr>
         <w:pStyle w:val="berschrift4"/>
@@ -2367,7 +2367,7 @@
         <w:t xml:space="preserve">meta-sencal-optical</w:t>
       </w:r>
     </w:p>
-    <w:bookmarkStart w:id="74" w:name="threshold-requirements-10"/>
+    <w:bookmarkStart w:id="77" w:name="threshold-requirements-10"/>
     <w:p>
       <w:pPr>
         <w:pStyle w:val="berschrift5"/>
@@ -2387,8 +2387,8 @@
         <w:t xml:space="preserve"> </w:t>
       </w:r>
     </w:p>
-    <w:bookmarkEnd w:id="74"/>
-    <w:bookmarkStart w:id="75" w:name="goal-requirements-10"/>
+    <w:bookmarkEnd w:id="77"/>
+    <w:bookmarkStart w:id="78" w:name="goal-requirements-10"/>
     <w:p>
       <w:pPr>
         <w:pStyle w:val="berschrift5"/>
@@ -2431,8 +2431,8 @@
         <w:t xml:space="preserve">Information on sensory calibration should be available in the metadata as a single DOI landing page.</w:t>
       </w:r>
     </w:p>
-    <w:bookmarkEnd w:id="75"/>
-    <w:bookmarkStart w:id="76" w:name="assessment-10"/>
+    <w:bookmarkEnd w:id="78"/>
+    <w:bookmarkStart w:id="79" w:name="assessment-10"/>
     <w:p>
       <w:pPr>
         <w:pStyle w:val="berschrift5"/>
@@ -2496,9 +2496,9 @@
         </w:pict>
       </w:r>
     </w:p>
-    <w:bookmarkEnd w:id="76"/>
-    <w:bookmarkEnd w:id="77"/>
-    <w:bookmarkStart w:id="81" w:name="sec:meta-radacc-sr"/>
+    <w:bookmarkEnd w:id="79"/>
+    <w:bookmarkEnd w:id="80"/>
+    <w:bookmarkStart w:id="84" w:name="sec:meta-radacc-sr"/>
     <w:p>
       <w:pPr>
         <w:pStyle w:val="berschrift4"/>
@@ -2533,7 +2533,7 @@
         <w:t xml:space="preserve">meta-radacc-sr</w:t>
       </w:r>
     </w:p>
-    <w:bookmarkStart w:id="78" w:name="threshold-requirements-11"/>
+    <w:bookmarkStart w:id="81" w:name="threshold-requirements-11"/>
     <w:p>
       <w:pPr>
         <w:pStyle w:val="berschrift5"/>
@@ -2553,8 +2553,8 @@
         <w:t xml:space="preserve"> </w:t>
       </w:r>
     </w:p>
-    <w:bookmarkEnd w:id="78"/>
-    <w:bookmarkStart w:id="79" w:name="goal-requirements-11"/>
+    <w:bookmarkEnd w:id="81"/>
+    <w:bookmarkStart w:id="82" w:name="goal-requirements-11"/>
     <w:p>
       <w:pPr>
         <w:pStyle w:val="berschrift5"/>
@@ -2591,8 +2591,8 @@
         <w:t xml:space="preserve">Information on radiometric accuracy should be available in the metadata as a single DOI landing page.</w:t>
       </w:r>
     </w:p>
-    <w:bookmarkEnd w:id="79"/>
-    <w:bookmarkStart w:id="80" w:name="assessment-11"/>
+    <w:bookmarkEnd w:id="82"/>
+    <w:bookmarkStart w:id="83" w:name="assessment-11"/>
     <w:p>
       <w:pPr>
         <w:pStyle w:val="berschrift5"/>
@@ -2656,9 +2656,9 @@
         </w:pict>
       </w:r>
     </w:p>
-    <w:bookmarkEnd w:id="80"/>
-    <w:bookmarkEnd w:id="81"/>
-    <w:bookmarkStart w:id="85" w:name="sec:meta-malgos-sr"/>
+    <w:bookmarkEnd w:id="83"/>
+    <w:bookmarkEnd w:id="84"/>
+    <w:bookmarkStart w:id="88" w:name="sec:meta-malgos-sr"/>
     <w:p>
       <w:pPr>
         <w:pStyle w:val="berschrift4"/>
@@ -2693,7 +2693,7 @@
         <w:t xml:space="preserve">meta-malgos-sr</w:t>
       </w:r>
     </w:p>
-    <w:bookmarkStart w:id="82" w:name="threshold-requirements-12"/>
+    <w:bookmarkStart w:id="85" w:name="threshold-requirements-12"/>
     <w:p>
       <w:pPr>
         <w:pStyle w:val="berschrift5"/>
@@ -2736,8 +2736,8 @@
         <w:t xml:space="preserve">Information on algorithms should be available in the metadata as a single DOI landing page.</w:t>
       </w:r>
     </w:p>
-    <w:bookmarkEnd w:id="82"/>
-    <w:bookmarkStart w:id="83" w:name="goal-requirements-12"/>
+    <w:bookmarkEnd w:id="85"/>
+    <w:bookmarkStart w:id="86" w:name="goal-requirements-12"/>
     <w:p>
       <w:pPr>
         <w:pStyle w:val="berschrift5"/>
@@ -2786,8 +2786,8 @@
         <w:t xml:space="preserve">Information on algorithms should be available in the metadata as a single DOI landing page.</w:t>
       </w:r>
     </w:p>
-    <w:bookmarkEnd w:id="83"/>
-    <w:bookmarkStart w:id="84" w:name="assessment-12"/>
+    <w:bookmarkEnd w:id="86"/>
+    <w:bookmarkStart w:id="87" w:name="assessment-12"/>
     <w:p>
       <w:pPr>
         <w:pStyle w:val="berschrift5"/>
@@ -2851,9 +2851,9 @@
         </w:pict>
       </w:r>
     </w:p>
-    <w:bookmarkEnd w:id="84"/>
-    <w:bookmarkEnd w:id="85"/>
-    <w:bookmarkStart w:id="89" w:name="sec:meta-auxdat-optical"/>
+    <w:bookmarkEnd w:id="87"/>
+    <w:bookmarkEnd w:id="88"/>
+    <w:bookmarkStart w:id="92" w:name="sec:meta-auxdat-optical"/>
     <w:p>
       <w:pPr>
         <w:pStyle w:val="berschrift4"/>
@@ -2888,7 +2888,7 @@
         <w:t xml:space="preserve">meta-auxdat-optical</w:t>
       </w:r>
     </w:p>
-    <w:bookmarkStart w:id="86" w:name="threshold-requirements-13"/>
+    <w:bookmarkStart w:id="89" w:name="threshold-requirements-13"/>
     <w:p>
       <w:pPr>
         <w:pStyle w:val="berschrift5"/>
@@ -2925,8 +2925,8 @@
         <w:t xml:space="preserve">Auxiliary data includes DEMs, aerosols, etc. data sources.</w:t>
       </w:r>
     </w:p>
-    <w:bookmarkEnd w:id="86"/>
-    <w:bookmarkStart w:id="87" w:name="goal-requirements-13"/>
+    <w:bookmarkEnd w:id="89"/>
+    <w:bookmarkStart w:id="90" w:name="goal-requirements-13"/>
     <w:p>
       <w:pPr>
         <w:pStyle w:val="berschrift5"/>
@@ -2943,8 +2943,8 @@
         <w:t xml:space="preserve">As threshold, but information on auxiliary data should be available in the metadata as a single DOI landing page and is also available for free online download, contemporaneously with the product or through a link to the source.</w:t>
       </w:r>
     </w:p>
-    <w:bookmarkEnd w:id="87"/>
-    <w:bookmarkStart w:id="88" w:name="assessment-13"/>
+    <w:bookmarkEnd w:id="90"/>
+    <w:bookmarkStart w:id="91" w:name="assessment-13"/>
     <w:p>
       <w:pPr>
         <w:pStyle w:val="berschrift5"/>
@@ -3008,9 +3008,9 @@
         </w:pict>
       </w:r>
     </w:p>
-    <w:bookmarkEnd w:id="88"/>
-    <w:bookmarkEnd w:id="89"/>
-    <w:bookmarkStart w:id="93" w:name="sec:meta-proprov-nlsr"/>
+    <w:bookmarkEnd w:id="91"/>
+    <w:bookmarkEnd w:id="92"/>
+    <w:bookmarkStart w:id="96" w:name="sec:meta-proprov-nlsr"/>
     <w:p>
       <w:pPr>
         <w:pStyle w:val="berschrift4"/>
@@ -3045,7 +3045,7 @@
         <w:t xml:space="preserve">meta-proprov-nlsr</w:t>
       </w:r>
     </w:p>
-    <w:bookmarkStart w:id="90" w:name="threshold-requirements-14"/>
+    <w:bookmarkStart w:id="93" w:name="threshold-requirements-14"/>
     <w:p>
       <w:pPr>
         <w:pStyle w:val="berschrift5"/>
@@ -3065,8 +3065,8 @@
         <w:t xml:space="preserve"> </w:t>
       </w:r>
     </w:p>
-    <w:bookmarkEnd w:id="90"/>
-    <w:bookmarkStart w:id="91" w:name="goal-requirements-14"/>
+    <w:bookmarkEnd w:id="93"/>
+    <w:bookmarkStart w:id="94" w:name="goal-requirements-14"/>
     <w:p>
       <w:pPr>
         <w:pStyle w:val="berschrift5"/>
@@ -3083,8 +3083,8 @@
         <w:t xml:space="preserve">Information on processing chain provenance should be available in the metadata as a single DOI landing page containing detailed description of the processing steps used to generate the product, the organization that performed the processing, and the versions of software used, giving full transparency to the users.</w:t>
       </w:r>
     </w:p>
-    <w:bookmarkEnd w:id="91"/>
-    <w:bookmarkStart w:id="92" w:name="assessment-14"/>
+    <w:bookmarkEnd w:id="94"/>
+    <w:bookmarkStart w:id="95" w:name="assessment-14"/>
     <w:p>
       <w:pPr>
         <w:pStyle w:val="berschrift5"/>
@@ -3148,9 +3148,9 @@
         </w:pict>
       </w:r>
     </w:p>
-    <w:bookmarkEnd w:id="92"/>
-    <w:bookmarkEnd w:id="93"/>
-    <w:bookmarkStart w:id="97" w:name="sec:meta-daccess"/>
+    <w:bookmarkEnd w:id="95"/>
+    <w:bookmarkEnd w:id="96"/>
+    <w:bookmarkStart w:id="100" w:name="sec:meta-daccess"/>
     <w:p>
       <w:pPr>
         <w:pStyle w:val="berschrift4"/>
@@ -3185,7 +3185,7 @@
         <w:t xml:space="preserve">meta-daccess</w:t>
       </w:r>
     </w:p>
-    <w:bookmarkStart w:id="94" w:name="threshold-requirements-15"/>
+    <w:bookmarkStart w:id="97" w:name="threshold-requirements-15"/>
     <w:p>
       <w:pPr>
         <w:pStyle w:val="berschrift5"/>
@@ -3222,8 +3222,8 @@
         <w:t xml:space="preserve">Manual and offline interaction action (e.g., login) may be required.</w:t>
       </w:r>
     </w:p>
-    <w:bookmarkEnd w:id="94"/>
-    <w:bookmarkStart w:id="95" w:name="goal-requirements-15"/>
+    <w:bookmarkEnd w:id="97"/>
+    <w:bookmarkStart w:id="98" w:name="goal-requirements-15"/>
     <w:p>
       <w:pPr>
         <w:pStyle w:val="berschrift5"/>
@@ -3243,8 +3243,8 @@
         <w:t xml:space="preserve"> </w:t>
       </w:r>
     </w:p>
-    <w:bookmarkEnd w:id="95"/>
-    <w:bookmarkStart w:id="96" w:name="assessment-15"/>
+    <w:bookmarkEnd w:id="98"/>
+    <w:bookmarkStart w:id="99" w:name="assessment-15"/>
     <w:p>
       <w:pPr>
         <w:pStyle w:val="berschrift5"/>
@@ -3308,9 +3308,9 @@
         </w:pict>
       </w:r>
     </w:p>
-    <w:bookmarkEnd w:id="96"/>
-    <w:bookmarkEnd w:id="97"/>
-    <w:bookmarkStart w:id="101" w:name="sec:meta-odqual-sr"/>
+    <w:bookmarkEnd w:id="99"/>
+    <w:bookmarkEnd w:id="100"/>
+    <w:bookmarkStart w:id="104" w:name="sec:meta-odqual-sr"/>
     <w:p>
       <w:pPr>
         <w:pStyle w:val="berschrift4"/>
@@ -3345,7 +3345,7 @@
         <w:t xml:space="preserve">meta-odqual-sr</w:t>
       </w:r>
     </w:p>
-    <w:bookmarkStart w:id="98" w:name="threshold-requirements-16"/>
+    <w:bookmarkStart w:id="101" w:name="threshold-requirements-16"/>
     <w:p>
       <w:pPr>
         <w:pStyle w:val="berschrift5"/>
@@ -3365,8 +3365,8 @@
         <w:t xml:space="preserve"> </w:t>
       </w:r>
     </w:p>
-    <w:bookmarkEnd w:id="98"/>
-    <w:bookmarkStart w:id="99" w:name="goal-requirements-16"/>
+    <w:bookmarkEnd w:id="101"/>
+    <w:bookmarkStart w:id="102" w:name="goal-requirements-16"/>
     <w:p>
       <w:pPr>
         <w:pStyle w:val="berschrift5"/>
@@ -3395,8 +3395,8 @@
         <w:t xml:space="preserve">Proportion of observations over land (c.f. ocean) affected by non-target phenomena, e.g., cloud and cloud shadows</w:t>
       </w:r>
     </w:p>
-    <w:bookmarkEnd w:id="99"/>
-    <w:bookmarkStart w:id="100" w:name="assessment-16"/>
+    <w:bookmarkEnd w:id="102"/>
+    <w:bookmarkStart w:id="103" w:name="assessment-16"/>
     <w:p>
       <w:pPr>
         <w:pStyle w:val="berschrift5"/>
@@ -3453,10 +3453,10 @@
         <w:t xml:space="preserve">Recommended Requirement Modification:</w:t>
       </w:r>
     </w:p>
-    <w:bookmarkEnd w:id="100"/>
-    <w:bookmarkEnd w:id="101"/>
-    <w:bookmarkEnd w:id="102"/>
-    <w:bookmarkStart w:id="163" w:name="sec:pxl"/>
+    <w:bookmarkEnd w:id="103"/>
+    <w:bookmarkEnd w:id="104"/>
+    <w:bookmarkEnd w:id="105"/>
+    <w:bookmarkStart w:id="166" w:name="sec:pxl"/>
     <w:p>
       <w:pPr>
         <w:pStyle w:val="berschrift3"/>
@@ -3510,7 +3510,7 @@
         <w:t xml:space="preserve">(choose) observations on the basis of their individual suitability for application.</w:t>
       </w:r>
     </w:p>
-    <w:bookmarkStart w:id="106" w:name="sec:pxl-pimemare"/>
+    <w:bookmarkStart w:id="109" w:name="sec:pxl-pimemare"/>
     <w:p>
       <w:pPr>
         <w:pStyle w:val="berschrift4"/>
@@ -3545,7 +3545,7 @@
         <w:t xml:space="preserve">pxl-pimemare</w:t>
       </w:r>
     </w:p>
-    <w:bookmarkStart w:id="103" w:name="threshold-requirements-17"/>
+    <w:bookmarkStart w:id="106" w:name="threshold-requirements-17"/>
     <w:p>
       <w:pPr>
         <w:pStyle w:val="berschrift5"/>
@@ -3562,8 +3562,8 @@
         <w:t xml:space="preserve">Metadata is provided in a structure that enables a computer algorithm to be used to consistently and automatically identify and extract each component part for further use.</w:t>
       </w:r>
     </w:p>
-    <w:bookmarkEnd w:id="103"/>
-    <w:bookmarkStart w:id="104" w:name="goal-requirements-17"/>
+    <w:bookmarkEnd w:id="106"/>
+    <w:bookmarkStart w:id="107" w:name="goal-requirements-17"/>
     <w:p>
       <w:pPr>
         <w:pStyle w:val="berschrift5"/>
@@ -3583,8 +3583,8 @@
         <w:t xml:space="preserve"> </w:t>
       </w:r>
     </w:p>
-    <w:bookmarkEnd w:id="104"/>
-    <w:bookmarkStart w:id="105" w:name="assessment-17"/>
+    <w:bookmarkEnd w:id="107"/>
+    <w:bookmarkStart w:id="108" w:name="assessment-17"/>
     <w:p>
       <w:pPr>
         <w:pStyle w:val="berschrift5"/>
@@ -3648,9 +3648,9 @@
         </w:pict>
       </w:r>
     </w:p>
-    <w:bookmarkEnd w:id="105"/>
-    <w:bookmarkEnd w:id="106"/>
-    <w:bookmarkStart w:id="110" w:name="sec:pxl-pinodat"/>
+    <w:bookmarkEnd w:id="108"/>
+    <w:bookmarkEnd w:id="109"/>
+    <w:bookmarkStart w:id="113" w:name="sec:pxl-pinodat"/>
     <w:p>
       <w:pPr>
         <w:pStyle w:val="berschrift4"/>
@@ -3685,7 +3685,7 @@
         <w:t xml:space="preserve">pxl-pinodat</w:t>
       </w:r>
     </w:p>
-    <w:bookmarkStart w:id="107" w:name="threshold-requirements-18"/>
+    <w:bookmarkStart w:id="110" w:name="threshold-requirements-18"/>
     <w:p>
       <w:pPr>
         <w:pStyle w:val="berschrift5"/>
@@ -3699,17 +3699,11 @@
         <w:pStyle w:val="FirstParagraph"/>
       </w:pPr>
       <w:r>
-        <w:t xml:space="preserve">Pixels that do not correspond to an observation (</w:t>
-      </w:r>
-      <w:r>
-        <w:t xml:space="preserve">‘empty pixels’</w:t>
-      </w:r>
-      <w:r>
-        <w:t xml:space="preserve">) are flagged.</w:t>
-      </w:r>
-    </w:p>
-    <w:bookmarkEnd w:id="107"/>
-    <w:bookmarkStart w:id="108" w:name="goal-requirements-18"/>
+        <w:t xml:space="preserve">Pixels that do not correspond to an observation (‘empty pixels’) are flagged.</w:t>
+      </w:r>
+    </w:p>
+    <w:bookmarkEnd w:id="110"/>
+    <w:bookmarkStart w:id="111" w:name="goal-requirements-18"/>
     <w:p>
       <w:pPr>
         <w:pStyle w:val="berschrift5"/>
@@ -3729,8 +3723,8 @@
         <w:t xml:space="preserve"> </w:t>
       </w:r>
     </w:p>
-    <w:bookmarkEnd w:id="108"/>
-    <w:bookmarkStart w:id="109" w:name="assessment-18"/>
+    <w:bookmarkEnd w:id="111"/>
+    <w:bookmarkStart w:id="112" w:name="assessment-18"/>
     <w:p>
       <w:pPr>
         <w:pStyle w:val="berschrift5"/>
@@ -3794,9 +3788,9 @@
         </w:pict>
       </w:r>
     </w:p>
-    <w:bookmarkEnd w:id="109"/>
-    <w:bookmarkEnd w:id="110"/>
-    <w:bookmarkStart w:id="114" w:name="sec:pxl-pincot"/>
+    <w:bookmarkEnd w:id="112"/>
+    <w:bookmarkEnd w:id="113"/>
+    <w:bookmarkStart w:id="117" w:name="sec:pxl-pincot"/>
     <w:p>
       <w:pPr>
         <w:pStyle w:val="berschrift4"/>
@@ -3831,7 +3825,7 @@
         <w:t xml:space="preserve">pxl-pincot</w:t>
       </w:r>
     </w:p>
-    <w:bookmarkStart w:id="111" w:name="threshold-requirements-19"/>
+    <w:bookmarkStart w:id="114" w:name="threshold-requirements-19"/>
     <w:p>
       <w:pPr>
         <w:pStyle w:val="berschrift5"/>
@@ -3868,8 +3862,8 @@
         <w:t xml:space="preserve">This may be the result of missing ancillary data for a subset of the pixels.</w:t>
       </w:r>
     </w:p>
-    <w:bookmarkEnd w:id="111"/>
-    <w:bookmarkStart w:id="112" w:name="goal-requirements-19"/>
+    <w:bookmarkEnd w:id="114"/>
+    <w:bookmarkStart w:id="115" w:name="goal-requirements-19"/>
     <w:p>
       <w:pPr>
         <w:pStyle w:val="berschrift5"/>
@@ -3886,8 +3880,8 @@
         <w:t xml:space="preserve">The metadata identifies which tests have, and have not, been successfully completed for each pixel.</w:t>
       </w:r>
     </w:p>
-    <w:bookmarkEnd w:id="112"/>
-    <w:bookmarkStart w:id="113" w:name="assessment-19"/>
+    <w:bookmarkEnd w:id="115"/>
+    <w:bookmarkStart w:id="116" w:name="assessment-19"/>
     <w:p>
       <w:pPr>
         <w:pStyle w:val="berschrift5"/>
@@ -3951,9 +3945,9 @@
         </w:pict>
       </w:r>
     </w:p>
-    <w:bookmarkEnd w:id="113"/>
-    <w:bookmarkEnd w:id="114"/>
-    <w:bookmarkStart w:id="118" w:name="sec:pxl-pisatur"/>
+    <w:bookmarkEnd w:id="116"/>
+    <w:bookmarkEnd w:id="117"/>
+    <w:bookmarkStart w:id="121" w:name="sec:pxl-pisatur"/>
     <w:p>
       <w:pPr>
         <w:pStyle w:val="berschrift4"/>
@@ -3988,7 +3982,7 @@
         <w:t xml:space="preserve">pxl-pisatur</w:t>
       </w:r>
     </w:p>
-    <w:bookmarkStart w:id="115" w:name="threshold-requirements-20"/>
+    <w:bookmarkStart w:id="118" w:name="threshold-requirements-20"/>
     <w:p>
       <w:pPr>
         <w:pStyle w:val="berschrift5"/>
@@ -4005,8 +3999,8 @@
         <w:t xml:space="preserve">Metadata indicates where one or more pixel in the input spectral bands are saturated.</w:t>
       </w:r>
     </w:p>
-    <w:bookmarkEnd w:id="115"/>
-    <w:bookmarkStart w:id="116" w:name="goal-requirements-20"/>
+    <w:bookmarkEnd w:id="118"/>
+    <w:bookmarkStart w:id="119" w:name="goal-requirements-20"/>
     <w:p>
       <w:pPr>
         <w:pStyle w:val="berschrift5"/>
@@ -4023,8 +4017,8 @@
         <w:t xml:space="preserve">Metadata indicates which pixels are saturated for each spectral band.</w:t>
       </w:r>
     </w:p>
-    <w:bookmarkEnd w:id="116"/>
-    <w:bookmarkStart w:id="117" w:name="assessment-20"/>
+    <w:bookmarkEnd w:id="119"/>
+    <w:bookmarkStart w:id="120" w:name="assessment-20"/>
     <w:p>
       <w:pPr>
         <w:pStyle w:val="berschrift5"/>
@@ -4088,9 +4082,9 @@
         </w:pict>
       </w:r>
     </w:p>
-    <w:bookmarkEnd w:id="117"/>
-    <w:bookmarkEnd w:id="118"/>
-    <w:bookmarkStart w:id="122" w:name="sec:pxl-picloud"/>
+    <w:bookmarkEnd w:id="120"/>
+    <w:bookmarkEnd w:id="121"/>
+    <w:bookmarkStart w:id="125" w:name="sec:pxl-picloud"/>
     <w:p>
       <w:pPr>
         <w:pStyle w:val="berschrift4"/>
@@ -4125,7 +4119,7 @@
         <w:t xml:space="preserve">pxl-picloud</w:t>
       </w:r>
     </w:p>
-    <w:bookmarkStart w:id="119" w:name="threshold-requirements-21"/>
+    <w:bookmarkStart w:id="122" w:name="threshold-requirements-21"/>
     <w:p>
       <w:pPr>
         <w:pStyle w:val="berschrift5"/>
@@ -4142,8 +4136,8 @@
         <w:t xml:space="preserve">Metadata indicates whether a pixel is assessed as being cloud.</w:t>
       </w:r>
     </w:p>
-    <w:bookmarkEnd w:id="119"/>
-    <w:bookmarkStart w:id="120" w:name="goal-requirements-21"/>
+    <w:bookmarkEnd w:id="122"/>
+    <w:bookmarkStart w:id="123" w:name="goal-requirements-21"/>
     <w:p>
       <w:pPr>
         <w:pStyle w:val="berschrift5"/>
@@ -4160,8 +4154,8 @@
         <w:t xml:space="preserve">As threshold, but information on cloud detection should be available in the metadata as a single DOI landing page.</w:t>
       </w:r>
     </w:p>
-    <w:bookmarkEnd w:id="120"/>
-    <w:bookmarkStart w:id="121" w:name="assessment-21"/>
+    <w:bookmarkEnd w:id="123"/>
+    <w:bookmarkStart w:id="124" w:name="assessment-21"/>
     <w:p>
       <w:pPr>
         <w:pStyle w:val="berschrift5"/>
@@ -4225,9 +4219,9 @@
         </w:pict>
       </w:r>
     </w:p>
-    <w:bookmarkEnd w:id="121"/>
-    <w:bookmarkEnd w:id="122"/>
-    <w:bookmarkStart w:id="126" w:name="sec:pxl-picloudsh-nlsr"/>
+    <w:bookmarkEnd w:id="124"/>
+    <w:bookmarkEnd w:id="125"/>
+    <w:bookmarkStart w:id="129" w:name="sec:pxl-picloudsh-nlsr"/>
     <w:p>
       <w:pPr>
         <w:pStyle w:val="berschrift4"/>
@@ -4262,7 +4256,7 @@
         <w:t xml:space="preserve">pxl-picloudsh-nlsr</w:t>
       </w:r>
     </w:p>
-    <w:bookmarkStart w:id="123" w:name="threshold-requirements-22"/>
+    <w:bookmarkStart w:id="126" w:name="threshold-requirements-22"/>
     <w:p>
       <w:pPr>
         <w:pStyle w:val="berschrift5"/>
@@ -4282,8 +4276,8 @@
         <w:t xml:space="preserve"> </w:t>
       </w:r>
     </w:p>
-    <w:bookmarkEnd w:id="123"/>
-    <w:bookmarkStart w:id="124" w:name="goal-requirements-22"/>
+    <w:bookmarkEnd w:id="126"/>
+    <w:bookmarkStart w:id="127" w:name="goal-requirements-22"/>
     <w:p>
       <w:pPr>
         <w:pStyle w:val="berschrift5"/>
@@ -4306,8 +4300,8 @@
         <w:t xml:space="preserve">Information on cloud shadow detection should be available in the metadata as a single DOI landing page.</w:t>
       </w:r>
     </w:p>
-    <w:bookmarkEnd w:id="124"/>
-    <w:bookmarkStart w:id="125" w:name="assessment-22"/>
+    <w:bookmarkEnd w:id="127"/>
+    <w:bookmarkStart w:id="128" w:name="assessment-22"/>
     <w:p>
       <w:pPr>
         <w:pStyle w:val="berschrift5"/>
@@ -4371,9 +4365,9 @@
         </w:pict>
       </w:r>
     </w:p>
-    <w:bookmarkEnd w:id="125"/>
-    <w:bookmarkEnd w:id="126"/>
-    <w:bookmarkStart w:id="130" w:name="sec:pxl-lawama-nlsr"/>
+    <w:bookmarkEnd w:id="128"/>
+    <w:bookmarkEnd w:id="129"/>
+    <w:bookmarkStart w:id="133" w:name="sec:pxl-lawama-nlsr"/>
     <w:p>
       <w:pPr>
         <w:pStyle w:val="berschrift4"/>
@@ -4408,7 +4402,7 @@
         <w:t xml:space="preserve">pxl-lawama-nlsr</w:t>
       </w:r>
     </w:p>
-    <w:bookmarkStart w:id="127" w:name="threshold-requirements-23"/>
+    <w:bookmarkStart w:id="130" w:name="threshold-requirements-23"/>
     <w:p>
       <w:pPr>
         <w:pStyle w:val="berschrift5"/>
@@ -4425,8 +4419,8 @@
         <w:t xml:space="preserve">Metadata indicates whether a pixel is land or water.</w:t>
       </w:r>
     </w:p>
-    <w:bookmarkEnd w:id="127"/>
-    <w:bookmarkStart w:id="128" w:name="goal-requirements-23"/>
+    <w:bookmarkEnd w:id="130"/>
+    <w:bookmarkStart w:id="131" w:name="goal-requirements-23"/>
     <w:p>
       <w:pPr>
         <w:pStyle w:val="berschrift5"/>
@@ -4443,8 +4437,8 @@
         <w:t xml:space="preserve">As threshold, information on land/water mask should be available in the metadata as a single DOI landing page.</w:t>
       </w:r>
     </w:p>
-    <w:bookmarkEnd w:id="128"/>
-    <w:bookmarkStart w:id="129" w:name="assessment-23"/>
+    <w:bookmarkEnd w:id="131"/>
+    <w:bookmarkStart w:id="132" w:name="assessment-23"/>
     <w:p>
       <w:pPr>
         <w:pStyle w:val="berschrift5"/>
@@ -4508,9 +4502,9 @@
         </w:pict>
       </w:r>
     </w:p>
-    <w:bookmarkEnd w:id="129"/>
-    <w:bookmarkEnd w:id="130"/>
-    <w:bookmarkStart w:id="134" w:name="sec:pxl-snowice-nlsr"/>
+    <w:bookmarkEnd w:id="132"/>
+    <w:bookmarkEnd w:id="133"/>
+    <w:bookmarkStart w:id="137" w:name="sec:pxl-snowice-nlsr"/>
     <w:p>
       <w:pPr>
         <w:pStyle w:val="berschrift4"/>
@@ -4545,7 +4539,7 @@
         <w:t xml:space="preserve">pxl-snowice-nlsr</w:t>
       </w:r>
     </w:p>
-    <w:bookmarkStart w:id="131" w:name="threshold-requirements-24"/>
+    <w:bookmarkStart w:id="134" w:name="threshold-requirements-24"/>
     <w:p>
       <w:pPr>
         <w:pStyle w:val="berschrift5"/>
@@ -4562,8 +4556,8 @@
         <w:t xml:space="preserve">Metadata indicates whether a pixel is snow/ice.</w:t>
       </w:r>
     </w:p>
-    <w:bookmarkEnd w:id="131"/>
-    <w:bookmarkStart w:id="132" w:name="goal-requirements-24"/>
+    <w:bookmarkEnd w:id="134"/>
+    <w:bookmarkStart w:id="135" w:name="goal-requirements-24"/>
     <w:p>
       <w:pPr>
         <w:pStyle w:val="berschrift5"/>
@@ -4580,8 +4574,8 @@
         <w:t xml:space="preserve">As threshold, information on snow/ice mask should be available in the metadata as a single DOI landing page.</w:t>
       </w:r>
     </w:p>
-    <w:bookmarkEnd w:id="132"/>
-    <w:bookmarkStart w:id="133" w:name="assessment-24"/>
+    <w:bookmarkEnd w:id="135"/>
+    <w:bookmarkStart w:id="136" w:name="assessment-24"/>
     <w:p>
       <w:pPr>
         <w:pStyle w:val="berschrift5"/>
@@ -4645,9 +4639,9 @@
         </w:pict>
       </w:r>
     </w:p>
-    <w:bookmarkEnd w:id="133"/>
-    <w:bookmarkEnd w:id="134"/>
-    <w:bookmarkStart w:id="138" w:name="sec:pxl-tershad"/>
+    <w:bookmarkEnd w:id="136"/>
+    <w:bookmarkEnd w:id="137"/>
+    <w:bookmarkStart w:id="141" w:name="sec:pxl-tershad"/>
     <w:p>
       <w:pPr>
         <w:pStyle w:val="berschrift4"/>
@@ -4682,7 +4676,7 @@
         <w:t xml:space="preserve">pxl-tershad</w:t>
       </w:r>
     </w:p>
-    <w:bookmarkStart w:id="135" w:name="threshold-requirements-25"/>
+    <w:bookmarkStart w:id="138" w:name="threshold-requirements-25"/>
     <w:p>
       <w:pPr>
         <w:pStyle w:val="berschrift5"/>
@@ -4702,8 +4696,8 @@
         <w:t xml:space="preserve"> </w:t>
       </w:r>
     </w:p>
-    <w:bookmarkEnd w:id="135"/>
-    <w:bookmarkStart w:id="136" w:name="goal-requirements-25"/>
+    <w:bookmarkEnd w:id="138"/>
+    <w:bookmarkStart w:id="139" w:name="goal-requirements-25"/>
     <w:p>
       <w:pPr>
         <w:pStyle w:val="berschrift5"/>
@@ -4720,8 +4714,8 @@
         <w:t xml:space="preserve">The metadata indicates pixels that are not directly illuminated due to terrain shadowing.</w:t>
       </w:r>
     </w:p>
-    <w:bookmarkEnd w:id="136"/>
-    <w:bookmarkStart w:id="137" w:name="assessment-25"/>
+    <w:bookmarkEnd w:id="139"/>
+    <w:bookmarkStart w:id="140" w:name="assessment-25"/>
     <w:p>
       <w:pPr>
         <w:pStyle w:val="berschrift5"/>
@@ -4785,9 +4779,9 @@
         </w:pict>
       </w:r>
     </w:p>
-    <w:bookmarkEnd w:id="137"/>
-    <w:bookmarkEnd w:id="138"/>
-    <w:bookmarkStart w:id="142" w:name="sec:pxl-terocc"/>
+    <w:bookmarkEnd w:id="140"/>
+    <w:bookmarkEnd w:id="141"/>
+    <w:bookmarkStart w:id="145" w:name="sec:pxl-terocc"/>
     <w:p>
       <w:pPr>
         <w:pStyle w:val="berschrift4"/>
@@ -4822,7 +4816,7 @@
         <w:t xml:space="preserve">pxl-terocc</w:t>
       </w:r>
     </w:p>
-    <w:bookmarkStart w:id="139" w:name="threshold-requirements-26"/>
+    <w:bookmarkStart w:id="142" w:name="threshold-requirements-26"/>
     <w:p>
       <w:pPr>
         <w:pStyle w:val="berschrift5"/>
@@ -4842,8 +4836,8 @@
         <w:t xml:space="preserve"> </w:t>
       </w:r>
     </w:p>
-    <w:bookmarkEnd w:id="139"/>
-    <w:bookmarkStart w:id="140" w:name="goal-requirements-26"/>
+    <w:bookmarkEnd w:id="142"/>
+    <w:bookmarkStart w:id="143" w:name="goal-requirements-26"/>
     <w:p>
       <w:pPr>
         <w:pStyle w:val="berschrift5"/>
@@ -4860,8 +4854,8 @@
         <w:t xml:space="preserve">The metadata indicates pixels that are not visible to the sensor due to terrain occlusion during off-nadir viewing.</w:t>
       </w:r>
     </w:p>
-    <w:bookmarkEnd w:id="140"/>
-    <w:bookmarkStart w:id="141" w:name="assessment-26"/>
+    <w:bookmarkEnd w:id="143"/>
+    <w:bookmarkStart w:id="144" w:name="assessment-26"/>
     <w:p>
       <w:pPr>
         <w:pStyle w:val="berschrift5"/>
@@ -4925,9 +4919,9 @@
         </w:pict>
       </w:r>
     </w:p>
-    <w:bookmarkEnd w:id="141"/>
-    <w:bookmarkEnd w:id="142"/>
-    <w:bookmarkStart w:id="146" w:name="sec:pxl-vigelu"/>
+    <w:bookmarkEnd w:id="144"/>
+    <w:bookmarkEnd w:id="145"/>
+    <w:bookmarkStart w:id="149" w:name="sec:pxl-vigelu"/>
     <w:p>
       <w:pPr>
         <w:pStyle w:val="berschrift4"/>
@@ -4962,7 +4956,7 @@
         <w:t xml:space="preserve">pxl-vigelu</w:t>
       </w:r>
     </w:p>
-    <w:bookmarkStart w:id="143" w:name="threshold-requirements-27"/>
+    <w:bookmarkStart w:id="146" w:name="threshold-requirements-27"/>
     <w:p>
       <w:pPr>
         <w:pStyle w:val="berschrift5"/>
@@ -4979,8 +4973,8 @@
         <w:t xml:space="preserve">Provide average lunar and sensor viewing azimuth and zenith angles.</w:t>
       </w:r>
     </w:p>
-    <w:bookmarkEnd w:id="143"/>
-    <w:bookmarkStart w:id="144" w:name="goal-requirements-27"/>
+    <w:bookmarkEnd w:id="146"/>
+    <w:bookmarkStart w:id="147" w:name="goal-requirements-27"/>
     <w:p>
       <w:pPr>
         <w:pStyle w:val="berschrift5"/>
@@ -4997,8 +4991,8 @@
         <w:t xml:space="preserve">Provide per-pixel lunar and sensor viewing azimuth and zenith angles.</w:t>
       </w:r>
     </w:p>
-    <w:bookmarkEnd w:id="144"/>
-    <w:bookmarkStart w:id="145" w:name="assessment-27"/>
+    <w:bookmarkEnd w:id="147"/>
+    <w:bookmarkStart w:id="148" w:name="assessment-27"/>
     <w:p>
       <w:pPr>
         <w:pStyle w:val="berschrift5"/>
@@ -5062,9 +5056,9 @@
         </w:pict>
       </w:r>
     </w:p>
-    <w:bookmarkEnd w:id="145"/>
-    <w:bookmarkEnd w:id="146"/>
-    <w:bookmarkStart w:id="150" w:name="sec:pxl-piteric"/>
+    <w:bookmarkEnd w:id="148"/>
+    <w:bookmarkEnd w:id="149"/>
+    <w:bookmarkStart w:id="153" w:name="sec:pxl-piteric"/>
     <w:p>
       <w:pPr>
         <w:pStyle w:val="berschrift4"/>
@@ -5099,7 +5093,7 @@
         <w:t xml:space="preserve">pxl-piteric</w:t>
       </w:r>
     </w:p>
-    <w:bookmarkStart w:id="147" w:name="threshold-requirements-28"/>
+    <w:bookmarkStart w:id="150" w:name="threshold-requirements-28"/>
     <w:p>
       <w:pPr>
         <w:pStyle w:val="berschrift5"/>
@@ -5119,8 +5113,8 @@
         <w:t xml:space="preserve"> </w:t>
       </w:r>
     </w:p>
-    <w:bookmarkEnd w:id="147"/>
-    <w:bookmarkStart w:id="148" w:name="goal-requirements-28"/>
+    <w:bookmarkEnd w:id="150"/>
+    <w:bookmarkStart w:id="151" w:name="goal-requirements-28"/>
     <w:p>
       <w:pPr>
         <w:pStyle w:val="berschrift5"/>
@@ -5137,8 +5131,8 @@
         <w:t xml:space="preserve">Coefficients used for terrain illumination correction are provided for each pixel.</w:t>
       </w:r>
     </w:p>
-    <w:bookmarkEnd w:id="148"/>
-    <w:bookmarkStart w:id="149" w:name="assessment-28"/>
+    <w:bookmarkEnd w:id="151"/>
+    <w:bookmarkStart w:id="152" w:name="assessment-28"/>
     <w:p>
       <w:pPr>
         <w:pStyle w:val="berschrift5"/>
@@ -5202,9 +5196,9 @@
         </w:pict>
       </w:r>
     </w:p>
-    <w:bookmarkEnd w:id="149"/>
-    <w:bookmarkEnd w:id="150"/>
-    <w:bookmarkStart w:id="154" w:name="sec:pxl-moonilf"/>
+    <w:bookmarkEnd w:id="152"/>
+    <w:bookmarkEnd w:id="153"/>
+    <w:bookmarkStart w:id="157" w:name="sec:pxl-moonilf"/>
     <w:p>
       <w:pPr>
         <w:pStyle w:val="berschrift4"/>
@@ -5239,7 +5233,7 @@
         <w:t xml:space="preserve">pxl-moonilf</w:t>
       </w:r>
     </w:p>
-    <w:bookmarkStart w:id="151" w:name="threshold-requirements-29"/>
+    <w:bookmarkStart w:id="154" w:name="threshold-requirements-29"/>
     <w:p>
       <w:pPr>
         <w:pStyle w:val="berschrift5"/>
@@ -5256,8 +5250,8 @@
         <w:t xml:space="preserve">Provide average moon illumination fraction.</w:t>
       </w:r>
     </w:p>
-    <w:bookmarkEnd w:id="151"/>
-    <w:bookmarkStart w:id="152" w:name="goal-requirements-29"/>
+    <w:bookmarkEnd w:id="154"/>
+    <w:bookmarkStart w:id="155" w:name="goal-requirements-29"/>
     <w:p>
       <w:pPr>
         <w:pStyle w:val="berschrift5"/>
@@ -5274,8 +5268,8 @@
         <w:t xml:space="preserve">Provide per-pixel moon illumination fraction</w:t>
       </w:r>
     </w:p>
-    <w:bookmarkEnd w:id="152"/>
-    <w:bookmarkStart w:id="153" w:name="assessment-29"/>
+    <w:bookmarkEnd w:id="155"/>
+    <w:bookmarkStart w:id="156" w:name="assessment-29"/>
     <w:p>
       <w:pPr>
         <w:pStyle w:val="berschrift5"/>
@@ -5339,9 +5333,9 @@
         </w:pict>
       </w:r>
     </w:p>
-    <w:bookmarkEnd w:id="153"/>
-    <w:bookmarkEnd w:id="154"/>
-    <w:bookmarkStart w:id="158" w:name="sec:pxl-britemp"/>
+    <w:bookmarkEnd w:id="156"/>
+    <w:bookmarkEnd w:id="157"/>
+    <w:bookmarkStart w:id="161" w:name="sec:pxl-britemp"/>
     <w:p>
       <w:pPr>
         <w:pStyle w:val="berschrift4"/>
@@ -5376,7 +5370,7 @@
         <w:t xml:space="preserve">pxl-britemp</w:t>
       </w:r>
     </w:p>
-    <w:bookmarkStart w:id="155" w:name="threshold-requirements-30"/>
+    <w:bookmarkStart w:id="158" w:name="threshold-requirements-30"/>
     <w:p>
       <w:pPr>
         <w:pStyle w:val="berschrift5"/>
@@ -5393,8 +5387,8 @@
         <w:t xml:space="preserve">Provide brightness temperature from thermal bands.</w:t>
       </w:r>
     </w:p>
-    <w:bookmarkEnd w:id="155"/>
-    <w:bookmarkStart w:id="156" w:name="goal-requirements-30"/>
+    <w:bookmarkEnd w:id="158"/>
+    <w:bookmarkStart w:id="159" w:name="goal-requirements-30"/>
     <w:p>
       <w:pPr>
         <w:pStyle w:val="berschrift5"/>
@@ -5414,8 +5408,8 @@
         <w:t xml:space="preserve"> </w:t>
       </w:r>
     </w:p>
-    <w:bookmarkEnd w:id="156"/>
-    <w:bookmarkStart w:id="157" w:name="assessment-30"/>
+    <w:bookmarkEnd w:id="159"/>
+    <w:bookmarkStart w:id="160" w:name="assessment-30"/>
     <w:p>
       <w:pPr>
         <w:pStyle w:val="berschrift5"/>
@@ -5479,9 +5473,9 @@
         </w:pict>
       </w:r>
     </w:p>
-    <w:bookmarkEnd w:id="157"/>
-    <w:bookmarkEnd w:id="158"/>
-    <w:bookmarkStart w:id="162" w:name="sec:pxl-pisozea"/>
+    <w:bookmarkEnd w:id="160"/>
+    <w:bookmarkEnd w:id="161"/>
+    <w:bookmarkStart w:id="165" w:name="sec:pxl-pisozea"/>
     <w:p>
       <w:pPr>
         <w:pStyle w:val="berschrift4"/>
@@ -5516,7 +5510,7 @@
         <w:t xml:space="preserve">pxl-pisozea</w:t>
       </w:r>
     </w:p>
-    <w:bookmarkStart w:id="159" w:name="threshold-requirements-31"/>
+    <w:bookmarkStart w:id="162" w:name="threshold-requirements-31"/>
     <w:p>
       <w:pPr>
         <w:pStyle w:val="berschrift5"/>
@@ -5550,8 +5544,8 @@
         <w:t xml:space="preserve">).</w:t>
       </w:r>
     </w:p>
-    <w:bookmarkEnd w:id="159"/>
-    <w:bookmarkStart w:id="160" w:name="goal-requirements-31"/>
+    <w:bookmarkEnd w:id="162"/>
+    <w:bookmarkStart w:id="163" w:name="goal-requirements-31"/>
     <w:p>
       <w:pPr>
         <w:pStyle w:val="berschrift5"/>
@@ -5571,8 +5565,8 @@
         <w:t xml:space="preserve"> </w:t>
       </w:r>
     </w:p>
-    <w:bookmarkEnd w:id="160"/>
-    <w:bookmarkStart w:id="161" w:name="assessment-31"/>
+    <w:bookmarkEnd w:id="163"/>
+    <w:bookmarkStart w:id="164" w:name="assessment-31"/>
     <w:p>
       <w:pPr>
         <w:pStyle w:val="berschrift5"/>
@@ -5629,10 +5623,10 @@
         <w:t xml:space="preserve">Recommended Requirement Modification:</w:t>
       </w:r>
     </w:p>
-    <w:bookmarkEnd w:id="161"/>
-    <w:bookmarkEnd w:id="162"/>
-    <w:bookmarkEnd w:id="163"/>
-    <w:bookmarkStart w:id="188" w:name="sec:rac"/>
+    <w:bookmarkEnd w:id="164"/>
+    <w:bookmarkEnd w:id="165"/>
+    <w:bookmarkEnd w:id="166"/>
+    <w:bookmarkStart w:id="191" w:name="sec:rac"/>
     <w:p>
       <w:pPr>
         <w:pStyle w:val="berschrift3"/>
@@ -5664,7 +5658,7 @@
         <w:t xml:space="preserve">The requirements indicate both the necessary outcomes and the minimum steps necessary to be deemed to have achieved those outcomes.</w:t>
       </w:r>
     </w:p>
-    <w:bookmarkStart w:id="167" w:name="sec:rac-measur-nlsr"/>
+    <w:bookmarkStart w:id="170" w:name="sec:rac-measur-nlsr"/>
     <w:p>
       <w:pPr>
         <w:pStyle w:val="berschrift4"/>
@@ -5699,7 +5693,7 @@
         <w:t xml:space="preserve">rac-measur-nlsr</w:t>
       </w:r>
     </w:p>
-    <w:bookmarkStart w:id="164" w:name="threshold-requirements-32"/>
+    <w:bookmarkStart w:id="167" w:name="threshold-requirements-32"/>
     <w:p>
       <w:pPr>
         <w:pStyle w:val="berschrift5"/>
@@ -5736,8 +5730,8 @@
         <w:t xml:space="preserve">Radiometric corrections must lead to a valid measurement of surface reflectance.</w:t>
       </w:r>
     </w:p>
-    <w:bookmarkEnd w:id="164"/>
-    <w:bookmarkStart w:id="165" w:name="goal-requirements-32"/>
+    <w:bookmarkEnd w:id="167"/>
+    <w:bookmarkStart w:id="168" w:name="goal-requirements-32"/>
     <w:p>
       <w:pPr>
         <w:pStyle w:val="berschrift5"/>
@@ -5771,8 +5765,8 @@
         <w:t xml:space="preserve">).</w:t>
       </w:r>
     </w:p>
-    <w:bookmarkEnd w:id="165"/>
-    <w:bookmarkStart w:id="166" w:name="assessment-32"/>
+    <w:bookmarkEnd w:id="168"/>
+    <w:bookmarkStart w:id="169" w:name="assessment-32"/>
     <w:p>
       <w:pPr>
         <w:pStyle w:val="berschrift5"/>
@@ -5836,9 +5830,9 @@
         </w:pict>
       </w:r>
     </w:p>
-    <w:bookmarkEnd w:id="166"/>
-    <w:bookmarkEnd w:id="167"/>
-    <w:bookmarkStart w:id="171" w:name="sec:rac-muncer-sr"/>
+    <w:bookmarkEnd w:id="169"/>
+    <w:bookmarkEnd w:id="170"/>
+    <w:bookmarkStart w:id="174" w:name="sec:rac-muncer-sr"/>
     <w:p>
       <w:pPr>
         <w:pStyle w:val="berschrift4"/>
@@ -5881,7 +5875,7 @@
         <w:t xml:space="preserve">Note: In current practice, users determine fitness for purpose based on knowledge of the lineage of the data, rather than on a specific estimate of measurement uncertainty.</w:t>
       </w:r>
     </w:p>
-    <w:bookmarkStart w:id="168" w:name="threshold-requirements-33"/>
+    <w:bookmarkStart w:id="171" w:name="threshold-requirements-33"/>
     <w:p>
       <w:pPr>
         <w:pStyle w:val="berschrift5"/>
@@ -5901,8 +5895,8 @@
         <w:t xml:space="preserve"> </w:t>
       </w:r>
     </w:p>
-    <w:bookmarkEnd w:id="168"/>
-    <w:bookmarkStart w:id="169" w:name="goal-requirements-33"/>
+    <w:bookmarkEnd w:id="171"/>
+    <w:bookmarkStart w:id="172" w:name="goal-requirements-33"/>
     <w:p>
       <w:pPr>
         <w:pStyle w:val="berschrift5"/>
@@ -5968,8 +5962,8 @@
         <w:t xml:space="preserve">Information on measurement uncertainty should be available in the metadata as a single DOI landing page.</w:t>
       </w:r>
     </w:p>
-    <w:bookmarkEnd w:id="169"/>
-    <w:bookmarkStart w:id="170" w:name="assessment-33"/>
+    <w:bookmarkEnd w:id="172"/>
+    <w:bookmarkStart w:id="173" w:name="assessment-33"/>
     <w:p>
       <w:pPr>
         <w:pStyle w:val="berschrift5"/>
@@ -6033,9 +6027,9 @@
         </w:pict>
       </w:r>
     </w:p>
-    <w:bookmarkEnd w:id="170"/>
-    <w:bookmarkEnd w:id="171"/>
-    <w:bookmarkStart w:id="175" w:name="sec:rac-mnormal-nlsr"/>
+    <w:bookmarkEnd w:id="173"/>
+    <w:bookmarkEnd w:id="174"/>
+    <w:bookmarkStart w:id="178" w:name="sec:rac-mnormal-nlsr"/>
     <w:p>
       <w:pPr>
         <w:pStyle w:val="berschrift4"/>
@@ -6070,7 +6064,7 @@
         <w:t xml:space="preserve">rac-mnormal-nlsr</w:t>
       </w:r>
     </w:p>
-    <w:bookmarkStart w:id="172" w:name="threshold-requirements-34"/>
+    <w:bookmarkStart w:id="175" w:name="threshold-requirements-34"/>
     <w:p>
       <w:pPr>
         <w:pStyle w:val="berschrift5"/>
@@ -6090,8 +6084,8 @@
         <w:t xml:space="preserve"> </w:t>
       </w:r>
     </w:p>
-    <w:bookmarkEnd w:id="172"/>
-    <w:bookmarkStart w:id="173" w:name="goal-requirements-34"/>
+    <w:bookmarkEnd w:id="175"/>
+    <w:bookmarkStart w:id="176" w:name="goal-requirements-34"/>
     <w:p>
       <w:pPr>
         <w:pStyle w:val="berschrift5"/>
@@ -6134,8 +6128,8 @@
         <w:t xml:space="preserve">Information on measurement normalisation should be available in the metadata as a single DOI landing page.</w:t>
       </w:r>
     </w:p>
-    <w:bookmarkEnd w:id="173"/>
-    <w:bookmarkStart w:id="174" w:name="assessment-34"/>
+    <w:bookmarkEnd w:id="176"/>
+    <w:bookmarkStart w:id="177" w:name="assessment-34"/>
     <w:p>
       <w:pPr>
         <w:pStyle w:val="berschrift5"/>
@@ -6199,9 +6193,9 @@
         </w:pict>
       </w:r>
     </w:p>
-    <w:bookmarkEnd w:id="174"/>
-    <w:bookmarkEnd w:id="175"/>
-    <w:bookmarkStart w:id="179" w:name="sec:rac-catcor"/>
+    <w:bookmarkEnd w:id="177"/>
+    <w:bookmarkEnd w:id="178"/>
+    <w:bookmarkStart w:id="182" w:name="sec:rac-catcor"/>
     <w:p>
       <w:pPr>
         <w:pStyle w:val="berschrift4"/>
@@ -6236,7 +6230,7 @@
         <w:t xml:space="preserve">rac-catcor</w:t>
       </w:r>
     </w:p>
-    <w:bookmarkStart w:id="176" w:name="threshold-requirements-35"/>
+    <w:bookmarkStart w:id="179" w:name="threshold-requirements-35"/>
     <w:p>
       <w:pPr>
         <w:pStyle w:val="berschrift5"/>
@@ -6317,8 +6311,8 @@
         <w:t xml:space="preserve">Examples of technical documentation include an Algorithm Theoretical Basis Document, product user guide, etc.</w:t>
       </w:r>
     </w:p>
-    <w:bookmarkEnd w:id="176"/>
-    <w:bookmarkStart w:id="177" w:name="goal-requirements-35"/>
+    <w:bookmarkEnd w:id="179"/>
+    <w:bookmarkStart w:id="180" w:name="goal-requirements-35"/>
     <w:p>
       <w:pPr>
         <w:pStyle w:val="berschrift5"/>
@@ -6338,8 +6332,8 @@
         <w:t xml:space="preserve"> </w:t>
       </w:r>
     </w:p>
-    <w:bookmarkEnd w:id="177"/>
-    <w:bookmarkStart w:id="178" w:name="assessment-35"/>
+    <w:bookmarkEnd w:id="180"/>
+    <w:bookmarkStart w:id="181" w:name="assessment-35"/>
     <w:p>
       <w:pPr>
         <w:pStyle w:val="berschrift5"/>
@@ -6403,9 +6397,9 @@
         </w:pict>
       </w:r>
     </w:p>
-    <w:bookmarkEnd w:id="178"/>
-    <w:bookmarkEnd w:id="179"/>
-    <w:bookmarkStart w:id="183" w:name="sec:rac-lunrad"/>
+    <w:bookmarkEnd w:id="181"/>
+    <w:bookmarkEnd w:id="182"/>
+    <w:bookmarkStart w:id="186" w:name="sec:rac-lunrad"/>
     <w:p>
       <w:pPr>
         <w:pStyle w:val="berschrift4"/>
@@ -6440,7 +6434,7 @@
         <w:t xml:space="preserve">rac-lunrad</w:t>
       </w:r>
     </w:p>
-    <w:bookmarkStart w:id="180" w:name="threshold-requirements-36"/>
+    <w:bookmarkStart w:id="183" w:name="threshold-requirements-36"/>
     <w:p>
       <w:pPr>
         <w:pStyle w:val="berschrift5"/>
@@ -6509,8 +6503,8 @@
         <w:t xml:space="preserve">Examples of technical documentation include an Algorithm Theoretical Basis Document, product user guide, etc.</w:t>
       </w:r>
     </w:p>
-    <w:bookmarkEnd w:id="180"/>
-    <w:bookmarkStart w:id="181" w:name="goal-requirements-36"/>
+    <w:bookmarkEnd w:id="183"/>
+    <w:bookmarkStart w:id="184" w:name="goal-requirements-36"/>
     <w:p>
       <w:pPr>
         <w:pStyle w:val="berschrift5"/>
@@ -6530,8 +6524,8 @@
         <w:t xml:space="preserve"> </w:t>
       </w:r>
     </w:p>
-    <w:bookmarkEnd w:id="181"/>
-    <w:bookmarkStart w:id="182" w:name="assessment-36"/>
+    <w:bookmarkEnd w:id="184"/>
+    <w:bookmarkStart w:id="185" w:name="assessment-36"/>
     <w:p>
       <w:pPr>
         <w:pStyle w:val="berschrift5"/>
@@ -6595,9 +6589,9 @@
         </w:pict>
       </w:r>
     </w:p>
-    <w:bookmarkEnd w:id="182"/>
-    <w:bookmarkEnd w:id="183"/>
-    <w:bookmarkStart w:id="187" w:name="sec:rac-strali"/>
+    <w:bookmarkEnd w:id="185"/>
+    <w:bookmarkEnd w:id="186"/>
+    <w:bookmarkStart w:id="190" w:name="sec:rac-strali"/>
     <w:p>
       <w:pPr>
         <w:pStyle w:val="berschrift4"/>
@@ -6632,7 +6626,7 @@
         <w:t xml:space="preserve">rac-strali</w:t>
       </w:r>
     </w:p>
-    <w:bookmarkStart w:id="184" w:name="threshold-requirements-37"/>
+    <w:bookmarkStart w:id="187" w:name="threshold-requirements-37"/>
     <w:p>
       <w:pPr>
         <w:pStyle w:val="berschrift5"/>
@@ -6701,8 +6695,8 @@
         <w:t xml:space="preserve">Examples of technical documentation include an Algorithm Theoretical Basis Document, product user guide, etc.</w:t>
       </w:r>
     </w:p>
-    <w:bookmarkEnd w:id="184"/>
-    <w:bookmarkStart w:id="185" w:name="goal-requirements-37"/>
+    <w:bookmarkEnd w:id="187"/>
+    <w:bookmarkStart w:id="188" w:name="goal-requirements-37"/>
     <w:p>
       <w:pPr>
         <w:pStyle w:val="berschrift5"/>
@@ -6722,8 +6716,8 @@
         <w:t xml:space="preserve"> </w:t>
       </w:r>
     </w:p>
-    <w:bookmarkEnd w:id="185"/>
-    <w:bookmarkStart w:id="186" w:name="assessment-37"/>
+    <w:bookmarkEnd w:id="188"/>
+    <w:bookmarkStart w:id="189" w:name="assessment-37"/>
     <w:p>
       <w:pPr>
         <w:pStyle w:val="berschrift5"/>
@@ -6780,10 +6774,10 @@
         <w:t xml:space="preserve">Recommended Requirement Modification:</w:t>
       </w:r>
     </w:p>
-    <w:bookmarkEnd w:id="186"/>
-    <w:bookmarkEnd w:id="187"/>
-    <w:bookmarkEnd w:id="188"/>
-    <w:bookmarkStart w:id="193" w:name="sec:gcor"/>
+    <w:bookmarkEnd w:id="189"/>
+    <w:bookmarkEnd w:id="190"/>
+    <w:bookmarkEnd w:id="191"/>
+    <w:bookmarkStart w:id="196" w:name="sec:gcor"/>
     <w:p>
       <w:pPr>
         <w:pStyle w:val="berschrift3"/>
@@ -6815,7 +6809,7 @@
         <w:t xml:space="preserve">This section specifies any geometric correction requirements that must be met in order for the data to be analysis ready.</w:t>
       </w:r>
     </w:p>
-    <w:bookmarkStart w:id="192" w:name="sec:gcor-geocorr-sr"/>
+    <w:bookmarkStart w:id="195" w:name="sec:gcor-geocorr-sr"/>
     <w:p>
       <w:pPr>
         <w:pStyle w:val="berschrift4"/>
@@ -6850,7 +6844,7 @@
         <w:t xml:space="preserve">gcor-geocorr-sr</w:t>
       </w:r>
     </w:p>
-    <w:bookmarkStart w:id="189" w:name="threshold-requirements-38"/>
+    <w:bookmarkStart w:id="192" w:name="threshold-requirements-38"/>
     <w:p>
       <w:pPr>
         <w:pStyle w:val="berschrift5"/>
@@ -6980,8 +6974,8 @@
         <w:t xml:space="preserve">sources as the geometric corrections for each of the sources may differ.</w:t>
       </w:r>
     </w:p>
-    <w:bookmarkEnd w:id="189"/>
-    <w:bookmarkStart w:id="190" w:name="goal-requirements-38"/>
+    <w:bookmarkEnd w:id="192"/>
+    <w:bookmarkStart w:id="193" w:name="goal-requirements-38"/>
     <w:p>
       <w:pPr>
         <w:pStyle w:val="berschrift5"/>
@@ -7071,8 +7065,8 @@
         <w:t xml:space="preserve">This requirement is intended to enable interoperability between imagery from different platforms that meet this level of correction, and with non-image spatial data such as GIS layers and terrain models.</w:t>
       </w:r>
     </w:p>
-    <w:bookmarkEnd w:id="190"/>
-    <w:bookmarkStart w:id="191" w:name="assessment-38"/>
+    <w:bookmarkEnd w:id="193"/>
+    <w:bookmarkStart w:id="194" w:name="assessment-38"/>
     <w:p>
       <w:pPr>
         <w:pStyle w:val="berschrift5"/>
@@ -7134,11 +7128,11 @@
         <w:br w:type="page"/>
       </w:r>
     </w:p>
-    <w:bookmarkEnd w:id="191"/>
-    <w:bookmarkEnd w:id="192"/>
-    <w:bookmarkEnd w:id="193"/>
     <w:bookmarkEnd w:id="194"/>
-    <w:bookmarkStart w:id="199" w:name="summary-self-assessment-table"/>
+    <w:bookmarkEnd w:id="195"/>
+    <w:bookmarkEnd w:id="196"/>
+    <w:bookmarkEnd w:id="197"/>
+    <w:bookmarkStart w:id="202" w:name="summary-self-assessment-table"/>
     <w:p>
       <w:pPr>
         <w:pStyle w:val="berschrift2"/>
@@ -7147,7 +7141,7 @@
         <w:t xml:space="preserve">Summary Self-Assessment Table</w:t>
       </w:r>
     </w:p>
-    <w:bookmarkStart w:id="195" w:name="general-metadata"/>
+    <w:bookmarkStart w:id="198" w:name="general-metadata"/>
     <w:p>
       <w:pPr>
         <w:pStyle w:val="berschrift3"/>
@@ -8032,8 +8026,8 @@
         </w:tc>
       </w:tr>
     </w:tbl>
-    <w:bookmarkEnd w:id="195"/>
-    <w:bookmarkStart w:id="196" w:name="per-pixel-metadata"/>
+    <w:bookmarkEnd w:id="198"/>
+    <w:bookmarkStart w:id="199" w:name="per-pixel-metadata"/>
     <w:p>
       <w:pPr>
         <w:pStyle w:val="berschrift3"/>
@@ -8815,8 +8809,8 @@
         </w:tc>
       </w:tr>
     </w:tbl>
-    <w:bookmarkEnd w:id="196"/>
-    <w:bookmarkStart w:id="197" w:name="radiometric-and-atmospheric-corrections"/>
+    <w:bookmarkEnd w:id="199"/>
+    <w:bookmarkStart w:id="200" w:name="radiometric-and-atmospheric-corrections"/>
     <w:p>
       <w:pPr>
         <w:pStyle w:val="berschrift3"/>
@@ -9187,8 +9181,8 @@
         </w:tc>
       </w:tr>
     </w:tbl>
-    <w:bookmarkEnd w:id="197"/>
-    <w:bookmarkStart w:id="198" w:name="geometric-corrections"/>
+    <w:bookmarkEnd w:id="200"/>
+    <w:bookmarkStart w:id="201" w:name="geometric-corrections"/>
     <w:p>
       <w:pPr>
         <w:pStyle w:val="berschrift3"/>
@@ -9309,9 +9303,9 @@
         <w:br w:type="page"/>
       </w:r>
     </w:p>
-    <w:bookmarkEnd w:id="198"/>
-    <w:bookmarkEnd w:id="199"/>
-    <w:bookmarkStart w:id="204" w:name="introduction"/>
+    <w:bookmarkEnd w:id="201"/>
+    <w:bookmarkEnd w:id="202"/>
+    <w:bookmarkStart w:id="207" w:name="introduction"/>
     <w:p>
       <w:pPr>
         <w:pStyle w:val="berschrift2"/>
@@ -9340,7 +9334,7 @@
         <w:t xml:space="preserve">This Guidance material does not replace or override the specifications.</w:t>
       </w:r>
     </w:p>
-    <w:bookmarkStart w:id="200" w:name="sec:intro-what-are-ceos-ard-products"/>
+    <w:bookmarkStart w:id="203" w:name="sec:intro-what-are-ceos-ard-products"/>
     <w:p>
       <w:pPr>
         <w:pStyle w:val="berschrift3"/>
@@ -9399,8 +9393,8 @@
         <w:t xml:space="preserve">for other types of satellite products.</w:t>
       </w:r>
     </w:p>
-    <w:bookmarkEnd w:id="200"/>
-    <w:bookmarkStart w:id="202" w:name="sec:intro-when-is-a-product-ceos-ard"/>
+    <w:bookmarkEnd w:id="203"/>
+    <w:bookmarkStart w:id="205" w:name="sec:intro-when-is-a-product-ceos-ard"/>
     <w:p>
       <w:pPr>
         <w:pStyle w:val="berschrift3"/>
@@ -9451,7 +9445,7 @@
       <w:r>
         <w:t xml:space="preserve"> </w:t>
       </w:r>
-      <w:hyperlink r:id="rId201">
+      <w:hyperlink r:id="rId204">
         <w:r>
           <w:rPr>
             <w:rStyle w:val="Hyperlink"/>
@@ -9471,8 +9465,8 @@
         <w:t xml:space="preserve">A product can continue to use CEOS-ARD branding as long as its generation and distribution remain consistent with the peer-reviewed assessment.</w:t>
       </w:r>
     </w:p>
-    <w:bookmarkEnd w:id="202"/>
-    <w:bookmarkStart w:id="203" w:name="sec:intro-difference-threshold-goal"/>
+    <w:bookmarkEnd w:id="205"/>
+    <w:bookmarkStart w:id="206" w:name="sec:intro-difference-threshold-goal"/>
     <w:p>
       <w:pPr>
         <w:pStyle w:val="berschrift3"/>
@@ -9536,16 +9530,7 @@
         <w:t xml:space="preserve"> </w:t>
       </w:r>
       <w:r>
-        <w:t xml:space="preserve">(Desired) requirements (previously referred to as</w:t>
-      </w:r>
-      <w:r>
-        <w:t xml:space="preserve"> </w:t>
-      </w:r>
-      <w:r>
-        <w:t xml:space="preserve">“Target”</w:t>
-      </w:r>
-      <w:r>
-        <w:t xml:space="preserve">) are the ideal; where we would like to be.</w:t>
+        <w:t xml:space="preserve">(Desired) requirements (previously referred to as “Target”) are the ideal; where we would like to be.</w:t>
       </w:r>
       <w:r>
         <w:t xml:space="preserve"> </w:t>
@@ -9675,9 +9660,9 @@
         <w:br w:type="page"/>
       </w:r>
     </w:p>
-    <w:bookmarkEnd w:id="203"/>
-    <w:bookmarkEnd w:id="204"/>
-    <w:bookmarkStart w:id="215" w:name="references"/>
+    <w:bookmarkEnd w:id="206"/>
+    <w:bookmarkEnd w:id="207"/>
+    <w:bookmarkStart w:id="218" w:name="references"/>
     <w:p>
       <w:pPr>
         <w:pStyle w:val="berschrift2"/>
@@ -9686,8 +9671,8 @@
         <w:t xml:space="preserve">References</w:t>
       </w:r>
     </w:p>
-    <w:bookmarkStart w:id="214" w:name="refs"/>
-    <w:bookmarkStart w:id="205" w:name="ref-iso19115_2_2009"/>
+    <w:bookmarkStart w:id="217" w:name="refs"/>
+    <w:bookmarkStart w:id="208" w:name="ref-iso19115_2_2009"/>
     <w:p>
       <w:pPr>
         <w:pStyle w:val="Literaturverzeichnis"/>
@@ -9699,23 +9684,18 @@
         <w:t xml:space="preserve"> </w:t>
       </w:r>
       <w:r>
-        <w:t xml:space="preserve">“</w:t>
-      </w:r>
-      <w:r>
+        <w:rPr>
+          <w:i/>
+          <w:iCs/>
+        </w:rPr>
         <w:t xml:space="preserve">Geographic information — Metadata — Part 2: Extensions for imagery and gridded data</w:t>
       </w:r>
       <w:r>
-        <w:t xml:space="preserve">.”</w:t>
-      </w:r>
-      <w:r>
-        <w:t xml:space="preserve"> </w:t>
-      </w:r>
-      <w:r>
-        <w:t xml:space="preserve">Standard. Geneva, CH: International Organization for Standardization.</w:t>
-      </w:r>
-    </w:p>
-    <w:bookmarkEnd w:id="205"/>
-    <w:bookmarkStart w:id="207" w:name="ref-mills2014"/>
+        <w:t xml:space="preserve">. Standard. International Organization for Standardization.</w:t>
+      </w:r>
+    </w:p>
+    <w:bookmarkEnd w:id="208"/>
+    <w:bookmarkStart w:id="210" w:name="ref-mills2014"/>
     <w:p>
       <w:pPr>
         <w:pStyle w:val="Literaturverzeichnis"/>
@@ -9748,7 +9728,7 @@
       <w:r>
         <w:t xml:space="preserve"> </w:t>
       </w:r>
-      <w:hyperlink r:id="rId206">
+      <w:hyperlink r:id="rId209">
         <w:r>
           <w:rPr>
             <w:rStyle w:val="Hyperlink"/>
@@ -9760,14 +9740,14 @@
         <w:t xml:space="preserve">.</w:t>
       </w:r>
     </w:p>
-    <w:bookmarkEnd w:id="207"/>
-    <w:bookmarkStart w:id="209" w:name="ref-roman2018"/>
+    <w:bookmarkEnd w:id="210"/>
+    <w:bookmarkStart w:id="212" w:name="ref-roman2018"/>
     <w:p>
       <w:pPr>
         <w:pStyle w:val="Literaturverzeichnis"/>
       </w:pPr>
       <w:r>
-        <w:t xml:space="preserve">Román, Miguel O., Zhuosen Wang, Qingsong Sun, Virginia Kalb, Steven D. Miller, Andrew Molthan, Lori Schultz, et al. 2018.</w:t>
+        <w:t xml:space="preserve">Román, Miguel O., Zhuosen Wang, Qingsong Sun, et al. 2018.</w:t>
       </w:r>
       <w:r>
         <w:t xml:space="preserve"> </w:t>
@@ -9791,7 +9771,7 @@
       <w:r>
         <w:t xml:space="preserve">210: 113–43. https://doi.org/</w:t>
       </w:r>
-      <w:hyperlink r:id="rId208">
+      <w:hyperlink r:id="rId211">
         <w:r>
           <w:rPr>
             <w:rStyle w:val="Hyperlink"/>
@@ -9803,14 +9783,14 @@
         <w:t xml:space="preserve">.</w:t>
       </w:r>
     </w:p>
-    <w:bookmarkEnd w:id="209"/>
-    <w:bookmarkStart w:id="211" w:name="ref-ryan2019"/>
+    <w:bookmarkEnd w:id="212"/>
+    <w:bookmarkStart w:id="214" w:name="ref-ryan2019"/>
     <w:p>
       <w:pPr>
         <w:pStyle w:val="Literaturverzeichnis"/>
       </w:pPr>
       <w:r>
-        <w:t xml:space="preserve">Ryan, Robert E., Mary Pagnutti, Kara Burch, Larry Leigh, Timothy Ruggles, Changyong Cao, David Aaron, Slawomir Blonski, and Dennis Helder. 2019.</w:t>
+        <w:t xml:space="preserve">Ryan, Robert E., Mary Pagnutti, Kara Burch, et al. 2019.</w:t>
       </w:r>
       <w:r>
         <w:t xml:space="preserve"> </w:t>
@@ -9837,7 +9817,7 @@
       <w:r>
         <w:t xml:space="preserve"> </w:t>
       </w:r>
-      <w:hyperlink r:id="rId210">
+      <w:hyperlink r:id="rId213">
         <w:r>
           <w:rPr>
             <w:rStyle w:val="Hyperlink"/>
@@ -9849,8 +9829,8 @@
         <w:t xml:space="preserve">.</w:t>
       </w:r>
     </w:p>
-    <w:bookmarkEnd w:id="211"/>
-    <w:bookmarkStart w:id="213" w:name="ref-wang2021"/>
+    <w:bookmarkEnd w:id="214"/>
+    <w:bookmarkStart w:id="216" w:name="ref-wang2021"/>
     <w:p>
       <w:pPr>
         <w:pStyle w:val="Literaturverzeichnis"/>
@@ -9880,7 +9860,7 @@
       <w:r>
         <w:t xml:space="preserve">263: 112557. https://doi.org/</w:t>
       </w:r>
-      <w:hyperlink r:id="rId212">
+      <w:hyperlink r:id="rId215">
         <w:r>
           <w:rPr>
             <w:rStyle w:val="Hyperlink"/>
@@ -9892,16 +9872,16 @@
         <w:t xml:space="preserve">.</w:t>
       </w:r>
     </w:p>
-    <w:bookmarkEnd w:id="213"/>
-    <w:bookmarkEnd w:id="214"/>
-    <w:bookmarkEnd w:id="215"/>
     <w:bookmarkEnd w:id="216"/>
+    <w:bookmarkEnd w:id="217"/>
+    <w:bookmarkEnd w:id="218"/>
+    <w:bookmarkEnd w:id="219"/>
     <w:sectPr>
-      <w:headerReference r:id="rId11" w:type="even"/>
+      <w:headerReference r:id="rId9" w:type="even"/>
       <w:headerReference r:id="rId10" w:type="default"/>
-      <w:footerReference r:id="rId13" w:type="even"/>
+      <w:footerReference r:id="rId11" w:type="even"/>
       <w:footerReference r:id="rId12" w:type="default"/>
-      <w:headerReference r:id="rId9" w:type="first"/>
+      <w:headerReference r:id="rId13" w:type="first"/>
       <w:footerReference r:id="rId14" w:type="first"/>
       <w:pgSz w:code="9" w:h="16838" w:w="11906"/>
       <w:pgMar w:bottom="1080" w:footer="567" w:gutter="0" w:header="567" w:left="1440" w:right="1440" w:top="1080"/>

</xml_diff>